<commit_message>
Ajustes Actividad 02: transformaciones del Adapter, procesamiento paralelo del Composite y documento final
- Adaptadores Legacy y Cloud transforman parametros y respuestas de cada fabricante (getLogsOld, fetchUserData, JsonObject)
- procesarSubarbolParalelo en el cliente Composite y datos de prueba segun el enunciado
- Codigo fuente sin caracteres especiales
- README con correspondencia UML-codigo e instrucciones de ejecucion
- Documento: introduccion, URL del repositorio, participantes, conclusiones y capturas actualizadas
</commit_message>
<xml_diff>
--- a/Documentacion/PDS_Actividad_02_Grupo02.docx
+++ b/Documentacion/PDS_Actividad_02_Grupo02.docx
@@ -549,6 +549,26 @@
           <w:szCs w:val="14"/>
         </w:rPr>
         <w:t>digo:</w:t>
+      </w:r>
+    </w:p>
+    <w:p>
+      <w:pPr>
+        <w:ind w:hanging="567"/>
+        <w:rPr>
+          <w:rFonts w:ascii="Trajan Pro" w:hAnsi="Trajan Pro" w:cs="Times New Roman"/>
+          <w:color w:val="767171" w:themeColor="background2" w:themeShade="80"/>
+          <w:sz w:val="16"/>
+          <w:szCs w:val="12"/>
+        </w:rPr>
+      </w:pPr>
+      <w:r>
+        <w:rPr>
+          <w:rFonts w:ascii="Trajan Pro" w:hAnsi="Trajan Pro" w:cs="Times New Roman"/>
+          <w:color w:val="767171" w:themeColor="background2" w:themeShade="80"/>
+          <w:sz w:val="16"/>
+          <w:szCs w:val="12"/>
+        </w:rPr>
+        <w:t xml:space="preserve">https://github.com/carytnas/patrones-diseno-actividad2</w:t>
       </w:r>
     </w:p>
     <w:p>
@@ -708,6 +728,29 @@
         <w:t>Introducción</w:t>
       </w:r>
     </w:p>
+    <w:p>
+      <w:pPr>
+        <w:pStyle w:val="NormalWeb"/>
+        <w:shd w:val="clear" w:color="auto" w:fill="FFFFFF"/>
+        <w:spacing w:line="360" w:lineRule="auto"/>
+        <w:jc w:val="both"/>
+        <w:rPr>
+          <w:rFonts w:asciiTheme="minorHAnsi" w:hAnsiTheme="minorHAnsi" w:cstheme="minorHAnsi"/>
+          <w:color w:val="767171" w:themeColor="background2" w:themeShade="80"/>
+          <w:sz w:val="20"/>
+          <w:szCs w:val="20"/>
+        </w:rPr>
+      </w:pPr>
+      <w:r>
+        <w:rPr>
+          <w:rFonts w:asciiTheme="minorHAnsi" w:hAnsiTheme="minorHAnsi" w:cstheme="minorHAnsi"/>
+          <w:color w:val="767171" w:themeColor="background2" w:themeShade="80"/>
+          <w:sz w:val="20"/>
+          <w:szCs w:val="20"/>
+        </w:rPr>
+        <w:t xml:space="preserve">Los patrones estructurales describen cómo combinar clases y objetos para formar estructuras más grandes sin perder flexibilidad (Gamma et al., 1994). En esta actividad se analizan dos escenarios institucionales. El primero exige representar un presupuesto jerárquico en el que las partidas individuales y los grupos anidados deben tratarse de la misma forma; para resolverlo se aplica el patrón Composite. El segundo requiere integrar dispositivos biométricos de un nuevo fabricante, cuya biblioteca tiene una interfaz incompatible, sin alterar el contrato que utiliza el sistema de asistencia de la universidad; para resolverlo se aplica el patrón Adapter. En cada escenario se identifica el problema estructural, se justifica el patrón seleccionado, se presentan los diagramas UML y sus participantes, se describe la implementación en Java y se documenta el uso crítico de la inteligencia artificial.</w:t>
+      </w:r>
+    </w:p>
     <w:bookmarkEnd w:id="1"/>
     <w:bookmarkEnd w:id="2"/>
     <w:p>
@@ -755,31 +798,8 @@
           <w:sz w:val="20"/>
           <w:szCs w:val="20"/>
         </w:rPr>
-        <w:t>Justificación</w:t>
-      </w:r>
-      <w:r>
-        <w:rPr>
-          <w:rFonts w:eastAsiaTheme="majorEastAsia" w:cstheme="minorHAnsi"/>
-          <w:b/>
-          <w:bCs/>
-          <w:color w:val="2F5496" w:themeColor="accent1" w:themeShade="BF"/>
-          <w:sz w:val="20"/>
-          <w:szCs w:val="20"/>
-        </w:rPr>
-        <w:t xml:space="preserve"> (</w:t>
-      </w:r>
-      <w:r>
-        <w:rPr>
-          <w:rFonts w:eastAsiaTheme="majorEastAsia" w:cstheme="minorHAnsi"/>
-          <w:b/>
-          <w:bCs/>
-          <w:color w:val="2F5496" w:themeColor="accent1" w:themeShade="BF"/>
-          <w:sz w:val="20"/>
-          <w:szCs w:val="20"/>
-        </w:rPr>
-        <w:t xml:space="preserve">Gamma, E. et al. (1994) – </w:t>
-      </w:r>
-      <w:proofErr w:type="spellStart"/>
+        <w:t xml:space="preserve">Justificación (Gamma, E. et al. (1994) – </w:t>
+      </w:r>
       <w:r>
         <w:rPr>
           <w:rFonts w:eastAsiaTheme="majorEastAsia" w:cstheme="minorHAnsi"/>
@@ -791,90 +811,7 @@
           <w:sz w:val="20"/>
           <w:szCs w:val="20"/>
         </w:rPr>
-        <w:t>Design</w:t>
-      </w:r>
-      <w:proofErr w:type="spellEnd"/>
-      <w:r>
-        <w:rPr>
-          <w:rFonts w:eastAsiaTheme="majorEastAsia" w:cstheme="minorHAnsi"/>
-          <w:b/>
-          <w:bCs/>
-          <w:i/>
-          <w:iCs/>
-          <w:color w:val="2F5496" w:themeColor="accent1" w:themeShade="BF"/>
-          <w:sz w:val="20"/>
-          <w:szCs w:val="20"/>
-        </w:rPr>
-        <w:t xml:space="preserve"> </w:t>
-      </w:r>
-      <w:proofErr w:type="spellStart"/>
-      <w:r>
-        <w:rPr>
-          <w:rFonts w:eastAsiaTheme="majorEastAsia" w:cstheme="minorHAnsi"/>
-          <w:b/>
-          <w:bCs/>
-          <w:i/>
-          <w:iCs/>
-          <w:color w:val="2F5496" w:themeColor="accent1" w:themeShade="BF"/>
-          <w:sz w:val="20"/>
-          <w:szCs w:val="20"/>
-        </w:rPr>
-        <w:t>Patterns</w:t>
-      </w:r>
-      <w:proofErr w:type="spellEnd"/>
-      <w:r>
-        <w:rPr>
-          <w:rFonts w:eastAsiaTheme="majorEastAsia" w:cstheme="minorHAnsi"/>
-          <w:b/>
-          <w:bCs/>
-          <w:i/>
-          <w:iCs/>
-          <w:color w:val="2F5496" w:themeColor="accent1" w:themeShade="BF"/>
-          <w:sz w:val="20"/>
-          <w:szCs w:val="20"/>
-        </w:rPr>
-        <w:t xml:space="preserve"> (</w:t>
-      </w:r>
-      <w:proofErr w:type="spellStart"/>
-      <w:r>
-        <w:rPr>
-          <w:rFonts w:eastAsiaTheme="majorEastAsia" w:cstheme="minorHAnsi"/>
-          <w:b/>
-          <w:bCs/>
-          <w:i/>
-          <w:iCs/>
-          <w:color w:val="2F5496" w:themeColor="accent1" w:themeShade="BF"/>
-          <w:sz w:val="20"/>
-          <w:szCs w:val="20"/>
-        </w:rPr>
-        <w:t>GoF</w:t>
-      </w:r>
-      <w:proofErr w:type="spellEnd"/>
-      <w:r>
-        <w:rPr>
-          <w:rFonts w:eastAsiaTheme="majorEastAsia" w:cstheme="minorHAnsi"/>
-          <w:b/>
-          <w:bCs/>
-          <w:i/>
-          <w:iCs/>
-          <w:color w:val="2F5496" w:themeColor="accent1" w:themeShade="BF"/>
-          <w:sz w:val="20"/>
-          <w:szCs w:val="20"/>
-        </w:rPr>
-        <w:t>)</w:t>
-      </w:r>
-      <w:r>
-        <w:rPr>
-          <w:rFonts w:eastAsiaTheme="majorEastAsia" w:cstheme="minorHAnsi"/>
-          <w:b/>
-          <w:bCs/>
-          <w:i/>
-          <w:iCs/>
-          <w:color w:val="2F5496" w:themeColor="accent1" w:themeShade="BF"/>
-          <w:sz w:val="20"/>
-          <w:szCs w:val="20"/>
-        </w:rPr>
-        <w:t>)</w:t>
+        <w:t xml:space="preserve">Design Patterns (GoF))</w:t>
       </w:r>
     </w:p>
     <w:p>
@@ -993,29 +930,7 @@
           <w:szCs w:val="20"/>
           <w:lang w:eastAsia="es-ES_tradnl"/>
         </w:rPr>
-        <w:t xml:space="preserve">Se selecciona el patrón Composite (Patrón Estructural </w:t>
-      </w:r>
-      <w:proofErr w:type="spellStart"/>
-      <w:r>
-        <w:rPr>
-          <w:rFonts w:eastAsia="Times New Roman" w:cstheme="minorHAnsi"/>
-          <w:color w:val="767171" w:themeColor="background2" w:themeShade="80"/>
-          <w:sz w:val="20"/>
-          <w:szCs w:val="20"/>
-          <w:lang w:eastAsia="es-ES_tradnl"/>
-        </w:rPr>
-        <w:t>GoF</w:t>
-      </w:r>
-      <w:proofErr w:type="spellEnd"/>
-      <w:r>
-        <w:rPr>
-          <w:rFonts w:eastAsia="Times New Roman" w:cstheme="minorHAnsi"/>
-          <w:color w:val="767171" w:themeColor="background2" w:themeShade="80"/>
-          <w:sz w:val="20"/>
-          <w:szCs w:val="20"/>
-          <w:lang w:eastAsia="es-ES_tradnl"/>
-        </w:rPr>
-        <w:t>).</w:t>
+        <w:t xml:space="preserve">Se selecciona el patrón Composite (Patrón Estructural GoF).</w:t>
       </w:r>
     </w:p>
     <w:p>
@@ -1154,33 +1069,7 @@
           <w:szCs w:val="20"/>
           <w:lang w:eastAsia="es-ES_tradnl"/>
         </w:rPr>
-        <w:t>Componente (</w:t>
-      </w:r>
-      <w:proofErr w:type="spellStart"/>
-      <w:r>
-        <w:rPr>
-          <w:rFonts w:eastAsia="Times New Roman" w:cstheme="minorHAnsi"/>
-          <w:b/>
-          <w:bCs/>
-          <w:color w:val="767171" w:themeColor="background2" w:themeShade="80"/>
-          <w:sz w:val="20"/>
-          <w:szCs w:val="20"/>
-          <w:lang w:eastAsia="es-ES_tradnl"/>
-        </w:rPr>
-        <w:t>IElementoPresupuestario</w:t>
-      </w:r>
-      <w:proofErr w:type="spellEnd"/>
-      <w:r>
-        <w:rPr>
-          <w:rFonts w:eastAsia="Times New Roman" w:cstheme="minorHAnsi"/>
-          <w:b/>
-          <w:bCs/>
-          <w:color w:val="767171" w:themeColor="background2" w:themeShade="80"/>
-          <w:sz w:val="20"/>
-          <w:szCs w:val="20"/>
-          <w:lang w:eastAsia="es-ES_tradnl"/>
-        </w:rPr>
-        <w:t xml:space="preserve">): </w:t>
+        <w:t xml:space="preserve">Componente (IElementoPresupuestario): </w:t>
       </w:r>
     </w:p>
     <w:p>
@@ -1203,95 +1092,7 @@
           <w:szCs w:val="20"/>
           <w:lang w:eastAsia="es-ES_tradnl"/>
         </w:rPr>
-        <w:t>Declara la interfaz común para los objetos de la composición y define las operaciones (</w:t>
-      </w:r>
-      <w:proofErr w:type="spellStart"/>
-      <w:r>
-        <w:rPr>
-          <w:rFonts w:eastAsia="Times New Roman" w:cstheme="minorHAnsi"/>
-          <w:color w:val="767171" w:themeColor="background2" w:themeShade="80"/>
-          <w:sz w:val="20"/>
-          <w:szCs w:val="20"/>
-          <w:lang w:eastAsia="es-ES_tradnl"/>
-        </w:rPr>
-        <w:t>obtenerCodigo</w:t>
-      </w:r>
-      <w:proofErr w:type="spellEnd"/>
-      <w:r>
-        <w:rPr>
-          <w:rFonts w:eastAsia="Times New Roman" w:cstheme="minorHAnsi"/>
-          <w:color w:val="767171" w:themeColor="background2" w:themeShade="80"/>
-          <w:sz w:val="20"/>
-          <w:szCs w:val="20"/>
-          <w:lang w:eastAsia="es-ES_tradnl"/>
-        </w:rPr>
-        <w:t xml:space="preserve">(), </w:t>
-      </w:r>
-      <w:proofErr w:type="spellStart"/>
-      <w:r>
-        <w:rPr>
-          <w:rFonts w:eastAsia="Times New Roman" w:cstheme="minorHAnsi"/>
-          <w:color w:val="767171" w:themeColor="background2" w:themeShade="80"/>
-          <w:sz w:val="20"/>
-          <w:szCs w:val="20"/>
-          <w:lang w:eastAsia="es-ES_tradnl"/>
-        </w:rPr>
-        <w:t>obtenerDescripcion</w:t>
-      </w:r>
-      <w:proofErr w:type="spellEnd"/>
-      <w:r>
-        <w:rPr>
-          <w:rFonts w:eastAsia="Times New Roman" w:cstheme="minorHAnsi"/>
-          <w:color w:val="767171" w:themeColor="background2" w:themeShade="80"/>
-          <w:sz w:val="20"/>
-          <w:szCs w:val="20"/>
-          <w:lang w:eastAsia="es-ES_tradnl"/>
-        </w:rPr>
-        <w:t xml:space="preserve">(), </w:t>
-      </w:r>
-      <w:proofErr w:type="spellStart"/>
-      <w:r>
-        <w:rPr>
-          <w:rFonts w:eastAsia="Times New Roman" w:cstheme="minorHAnsi"/>
-          <w:color w:val="767171" w:themeColor="background2" w:themeShade="80"/>
-          <w:sz w:val="20"/>
-          <w:szCs w:val="20"/>
-          <w:lang w:eastAsia="es-ES_tradnl"/>
-        </w:rPr>
-        <w:t>calcularValorTotal</w:t>
-      </w:r>
-      <w:proofErr w:type="spellEnd"/>
-      <w:r>
-        <w:rPr>
-          <w:rFonts w:eastAsia="Times New Roman" w:cstheme="minorHAnsi"/>
-          <w:color w:val="767171" w:themeColor="background2" w:themeShade="80"/>
-          <w:sz w:val="20"/>
-          <w:szCs w:val="20"/>
-          <w:lang w:eastAsia="es-ES_tradnl"/>
-        </w:rPr>
-        <w:t xml:space="preserve">(), </w:t>
-      </w:r>
-      <w:proofErr w:type="spellStart"/>
-      <w:r>
-        <w:rPr>
-          <w:rFonts w:eastAsia="Times New Roman" w:cstheme="minorHAnsi"/>
-          <w:color w:val="767171" w:themeColor="background2" w:themeShade="80"/>
-          <w:sz w:val="20"/>
-          <w:szCs w:val="20"/>
-          <w:lang w:eastAsia="es-ES_tradnl"/>
-        </w:rPr>
-        <w:t>mostrarEstructura</w:t>
-      </w:r>
-      <w:proofErr w:type="spellEnd"/>
-      <w:r>
-        <w:rPr>
-          <w:rFonts w:eastAsia="Times New Roman" w:cstheme="minorHAnsi"/>
-          <w:color w:val="767171" w:themeColor="background2" w:themeShade="80"/>
-          <w:sz w:val="20"/>
-          <w:szCs w:val="20"/>
-          <w:lang w:eastAsia="es-ES_tradnl"/>
-        </w:rPr>
-        <w:t>()).</w:t>
+        <w:t xml:space="preserve">Declara la interfaz común para los objetos de la composición y define las operaciones (obtenerCodigo(), obtenerDescripcion(), calcularValorTotal(), mostrarEstructura()).</w:t>
       </w:r>
     </w:p>
     <w:p>
@@ -1332,33 +1133,7 @@
           <w:szCs w:val="20"/>
           <w:lang w:eastAsia="es-ES_tradnl"/>
         </w:rPr>
-        <w:t>Hoja (</w:t>
-      </w:r>
-      <w:proofErr w:type="spellStart"/>
-      <w:r>
-        <w:rPr>
-          <w:rFonts w:eastAsia="Times New Roman" w:cstheme="minorHAnsi"/>
-          <w:b/>
-          <w:bCs/>
-          <w:color w:val="767171" w:themeColor="background2" w:themeShade="80"/>
-          <w:sz w:val="20"/>
-          <w:szCs w:val="20"/>
-          <w:lang w:eastAsia="es-ES_tradnl"/>
-        </w:rPr>
-        <w:t>PartidaPresupuestaria</w:t>
-      </w:r>
-      <w:proofErr w:type="spellEnd"/>
-      <w:r>
-        <w:rPr>
-          <w:rFonts w:eastAsia="Times New Roman" w:cstheme="minorHAnsi"/>
-          <w:b/>
-          <w:bCs/>
-          <w:color w:val="767171" w:themeColor="background2" w:themeShade="80"/>
-          <w:sz w:val="20"/>
-          <w:szCs w:val="20"/>
-          <w:lang w:eastAsia="es-ES_tradnl"/>
-        </w:rPr>
-        <w:t>):</w:t>
+        <w:t>Hoja (PartidaPresupuestaria):</w:t>
       </w:r>
       <w:r>
         <w:rPr>
@@ -1432,33 +1207,7 @@
           <w:szCs w:val="20"/>
           <w:lang w:eastAsia="es-ES_tradnl"/>
         </w:rPr>
-        <w:t>Compuesto (</w:t>
-      </w:r>
-      <w:proofErr w:type="spellStart"/>
-      <w:r>
-        <w:rPr>
-          <w:rFonts w:eastAsia="Times New Roman" w:cstheme="minorHAnsi"/>
-          <w:b/>
-          <w:bCs/>
-          <w:color w:val="767171" w:themeColor="background2" w:themeShade="80"/>
-          <w:sz w:val="20"/>
-          <w:szCs w:val="20"/>
-          <w:lang w:eastAsia="es-ES_tradnl"/>
-        </w:rPr>
-        <w:t>GrupoPresupuestario</w:t>
-      </w:r>
-      <w:proofErr w:type="spellEnd"/>
-      <w:r>
-        <w:rPr>
-          <w:rFonts w:eastAsia="Times New Roman" w:cstheme="minorHAnsi"/>
-          <w:b/>
-          <w:bCs/>
-          <w:color w:val="767171" w:themeColor="background2" w:themeShade="80"/>
-          <w:sz w:val="20"/>
-          <w:szCs w:val="20"/>
-          <w:lang w:eastAsia="es-ES_tradnl"/>
-        </w:rPr>
-        <w:t>):</w:t>
+        <w:t>Compuesto (GrupoPresupuestario):</w:t>
       </w:r>
       <w:r>
         <w:rPr>
@@ -1492,29 +1241,7 @@
           <w:lang w:eastAsia="es-ES_tradnl"/>
         </w:rPr>
         <w:lastRenderedPageBreak/>
-        <w:t>Define el comportamiento para los elementos que tienen hijos, almacena componentes hijos (List&lt;</w:t>
-      </w:r>
-      <w:proofErr w:type="spellStart"/>
-      <w:r>
-        <w:rPr>
-          <w:rFonts w:eastAsia="Times New Roman" w:cstheme="minorHAnsi"/>
-          <w:color w:val="767171" w:themeColor="background2" w:themeShade="80"/>
-          <w:sz w:val="20"/>
-          <w:szCs w:val="20"/>
-          <w:lang w:eastAsia="es-ES_tradnl"/>
-        </w:rPr>
-        <w:t>IElementoPresupuestario</w:t>
-      </w:r>
-      <w:proofErr w:type="spellEnd"/>
-      <w:r>
-        <w:rPr>
-          <w:rFonts w:eastAsia="Times New Roman" w:cstheme="minorHAnsi"/>
-          <w:color w:val="767171" w:themeColor="background2" w:themeShade="80"/>
-          <w:sz w:val="20"/>
-          <w:szCs w:val="20"/>
-          <w:lang w:eastAsia="es-ES_tradnl"/>
-        </w:rPr>
-        <w:t>&gt;) y ejecuta las operaciones de forma recursiva (como la suma acumulada de valores).</w:t>
+        <w:t>Define el comportamiento para los elementos que tienen hijos, almacena componentes hijos (List&lt;IElementoPresupuestario&gt;) y ejecuta las operaciones de forma recursiva (como la suma acumulada de valores).</w:t>
       </w:r>
     </w:p>
     <w:p>
@@ -1557,7 +1284,7 @@
           <w:szCs w:val="20"/>
           <w:lang w:eastAsia="es-ES_tradnl"/>
         </w:rPr>
-        <w:t xml:space="preserve">Cliente (Main): </w:t>
+        <w:t xml:space="preserve">Cliente (MainPresupuestoConcurrente): </w:t>
       </w:r>
     </w:p>
     <w:p>
@@ -1580,7 +1307,7 @@
           <w:szCs w:val="20"/>
           <w:lang w:eastAsia="es-ES_tradnl"/>
         </w:rPr>
-        <w:t>Manipula los objetos en la estructura a través de la interfaz del componente.</w:t>
+        <w:t xml:space="preserve">Manipula los objetos de la estructura exclusivamente a través de la interfaz del componente. Mediante procesarSubarbolParalelo() evalúa subárboles de forma concurrente sin distinguir entre partidas y grupos.</w:t>
       </w:r>
     </w:p>
     <w:p>
@@ -1635,29 +1362,7 @@
           <w:sz w:val="20"/>
           <w:szCs w:val="20"/>
         </w:rPr>
-        <w:t xml:space="preserve">Diagrama </w:t>
-      </w:r>
-      <w:r>
-        <w:rPr>
-          <w:rFonts w:eastAsiaTheme="majorEastAsia" w:cstheme="minorHAnsi"/>
-          <w:b/>
-          <w:bCs/>
-          <w:color w:val="2F5496" w:themeColor="accent1" w:themeShade="BF"/>
-          <w:sz w:val="20"/>
-          <w:szCs w:val="20"/>
-        </w:rPr>
-        <w:t>(</w:t>
-      </w:r>
-      <w:r>
-        <w:rPr>
-          <w:rFonts w:eastAsiaTheme="majorEastAsia" w:cstheme="minorHAnsi"/>
-          <w:b/>
-          <w:bCs/>
-          <w:color w:val="2F5496" w:themeColor="accent1" w:themeShade="BF"/>
-          <w:sz w:val="20"/>
-          <w:szCs w:val="20"/>
-        </w:rPr>
-        <w:t xml:space="preserve">Fowler, M. (2004) – </w:t>
+        <w:t xml:space="preserve">Diagrama (Fowler, M. (2004) – </w:t>
       </w:r>
       <w:r>
         <w:rPr>
@@ -1670,24 +1375,22 @@
           <w:sz w:val="20"/>
           <w:szCs w:val="20"/>
         </w:rPr>
-        <w:t xml:space="preserve">UML </w:t>
-      </w:r>
-      <w:proofErr w:type="spellStart"/>
+        <w:t xml:space="preserve">UML Distilled</w:t>
+      </w:r>
       <w:r>
         <w:rPr>
           <w:rFonts w:eastAsiaTheme="majorEastAsia" w:cstheme="minorHAnsi"/>
           <w:b/>
           <w:bCs/>
-          <w:i/>
-          <w:iCs/>
           <w:color w:val="2F5496" w:themeColor="accent1" w:themeShade="BF"/>
           <w:sz w:val="20"/>
           <w:szCs w:val="20"/>
         </w:rPr>
-        <w:t>Distilled</w:t>
-      </w:r>
-      <w:proofErr w:type="spellEnd"/>
-      <w:r>
+        <w:t>.)</w:t>
+      </w:r>
+    </w:p>
+    <w:p>
+      <w:pPr>
         <w:rPr>
           <w:rFonts w:eastAsiaTheme="majorEastAsia" w:cstheme="minorHAnsi"/>
           <w:b/>
@@ -1696,8 +1399,7 @@
           <w:sz w:val="20"/>
           <w:szCs w:val="20"/>
         </w:rPr>
-        <w:t>.</w:t>
-      </w:r>
+      </w:pPr>
       <w:r>
         <w:rPr>
           <w:rFonts w:eastAsiaTheme="majorEastAsia" w:cstheme="minorHAnsi"/>
@@ -1707,41 +1409,7 @@
           <w:sz w:val="20"/>
           <w:szCs w:val="20"/>
         </w:rPr>
-        <w:t>)</w:t>
-      </w:r>
-    </w:p>
-    <w:p>
-      <w:pPr>
-        <w:rPr>
-          <w:rFonts w:eastAsiaTheme="majorEastAsia" w:cstheme="minorHAnsi"/>
-          <w:b/>
-          <w:bCs/>
-          <w:color w:val="2F5496" w:themeColor="accent1" w:themeShade="BF"/>
-          <w:sz w:val="20"/>
-          <w:szCs w:val="20"/>
-        </w:rPr>
-      </w:pPr>
-      <w:r>
-        <w:rPr>
-          <w:rFonts w:eastAsiaTheme="majorEastAsia" w:cstheme="minorHAnsi"/>
-          <w:b/>
-          <w:bCs/>
-          <w:color w:val="2F5496" w:themeColor="accent1" w:themeShade="BF"/>
-          <w:sz w:val="20"/>
-          <w:szCs w:val="20"/>
-        </w:rPr>
-        <w:t>Diagrama Original (Estructura base del Composite)</w:t>
-      </w:r>
-      <w:r>
-        <w:rPr>
-          <w:rFonts w:eastAsiaTheme="majorEastAsia" w:cstheme="minorHAnsi"/>
-          <w:b/>
-          <w:bCs/>
-          <w:color w:val="2F5496" w:themeColor="accent1" w:themeShade="BF"/>
-          <w:sz w:val="20"/>
-          <w:szCs w:val="20"/>
-        </w:rPr>
-        <w:t>.</w:t>
+        <w:t>Diagrama Original (Estructura base del Composite).</w:t>
       </w:r>
     </w:p>
     <w:p>
@@ -1822,7 +1490,7 @@
           <w:szCs w:val="20"/>
           <w:lang w:eastAsia="es-ES_tradnl"/>
         </w:rPr>
-        <w:t>Figura1: Diagrama de clases inicial de Composite</w:t>
+        <w:t>Figura 1: Diagrama de clases inicial de Composite</w:t>
       </w:r>
     </w:p>
     <w:p>
@@ -1864,19 +1532,7 @@
           <w:lang w:eastAsia="en-US"/>
         </w:rPr>
         <w:lastRenderedPageBreak/>
-        <w:t>Diagrama con Cambios Aceptados (Inclusión explícita del Cliente en la jerarquía y procesamiento paralelo)</w:t>
-      </w:r>
-      <w:r>
-        <w:rPr>
-          <w:rFonts w:asciiTheme="minorHAnsi" w:eastAsiaTheme="majorEastAsia" w:hAnsiTheme="minorHAnsi" w:cstheme="minorHAnsi"/>
-          <w:b/>
-          <w:bCs/>
-          <w:color w:val="2F5496" w:themeColor="accent1" w:themeShade="BF"/>
-          <w:sz w:val="20"/>
-          <w:szCs w:val="20"/>
-          <w:lang w:eastAsia="en-US"/>
-        </w:rPr>
-        <w:t>.</w:t>
+        <w:t>Diagrama con Cambios Aceptados (Inclusión explícita del Cliente en la jerarquía y procesamiento paralelo).</w:t>
       </w:r>
     </w:p>
     <w:p>
@@ -1958,34 +1614,7 @@
           <w:sz w:val="20"/>
           <w:szCs w:val="20"/>
         </w:rPr>
-        <w:t>Figura</w:t>
-      </w:r>
-      <w:r>
-        <w:rPr>
-          <w:rFonts w:cstheme="minorHAnsi"/>
-          <w:color w:val="767171" w:themeColor="background2" w:themeShade="80"/>
-          <w:sz w:val="20"/>
-          <w:szCs w:val="20"/>
-        </w:rPr>
-        <w:t>2</w:t>
-      </w:r>
-      <w:r>
-        <w:rPr>
-          <w:rFonts w:cstheme="minorHAnsi"/>
-          <w:color w:val="767171" w:themeColor="background2" w:themeShade="80"/>
-          <w:sz w:val="20"/>
-          <w:szCs w:val="20"/>
-        </w:rPr>
-        <w:t xml:space="preserve">: Diagrama </w:t>
-      </w:r>
-      <w:r>
-        <w:rPr>
-          <w:rFonts w:cstheme="minorHAnsi"/>
-          <w:color w:val="767171" w:themeColor="background2" w:themeShade="80"/>
-          <w:sz w:val="20"/>
-          <w:szCs w:val="20"/>
-        </w:rPr>
-        <w:t>Composite final con cambios aceptados</w:t>
+        <w:t xml:space="preserve">Figura 2: Diagrama Composite final con cambios aceptados</w:t>
       </w:r>
     </w:p>
     <w:p>
@@ -2072,31 +1701,7 @@
           <w:szCs w:val="20"/>
           <w:lang w:eastAsia="en-US"/>
         </w:rPr>
-        <w:t>Ruta de clases java escenario0</w:t>
-      </w:r>
-      <w:r>
-        <w:rPr>
-          <w:rFonts w:asciiTheme="minorHAnsi" w:eastAsiaTheme="majorEastAsia" w:hAnsiTheme="minorHAnsi" w:cstheme="minorHAnsi"/>
-          <w:b/>
-          <w:bCs/>
-          <w:color w:val="2F5496" w:themeColor="accent1" w:themeShade="BF"/>
-          <w:sz w:val="20"/>
-          <w:szCs w:val="20"/>
-          <w:lang w:eastAsia="en-US"/>
-        </w:rPr>
-        <w:t>1</w:t>
-      </w:r>
-      <w:r>
-        <w:rPr>
-          <w:rFonts w:asciiTheme="minorHAnsi" w:eastAsiaTheme="majorEastAsia" w:hAnsiTheme="minorHAnsi" w:cstheme="minorHAnsi"/>
-          <w:b/>
-          <w:bCs/>
-          <w:color w:val="2F5496" w:themeColor="accent1" w:themeShade="BF"/>
-          <w:sz w:val="20"/>
-          <w:szCs w:val="20"/>
-          <w:lang w:eastAsia="en-US"/>
-        </w:rPr>
-        <w:t xml:space="preserve"> en repositorio: </w:t>
+        <w:t xml:space="preserve">Ruta de clases java escenario01 en repositorio: </w:t>
       </w:r>
       <w:hyperlink r:id="rId11" w:history="1">
         <w:r>
@@ -2134,7 +1739,7 @@
         </w:rPr>
         <w:drawing>
           <wp:inline distT="0" distB="0" distL="0" distR="0" wp14:anchorId="5DCE66EC" wp14:editId="524F5741">
-            <wp:extent cx="3638550" cy="4420991"/>
+            <wp:extent cx="4600000" cy="4629639"/>
             <wp:effectExtent l="0" t="0" r="0" b="0"/>
             <wp:docPr id="45257964" name="Imagen 1"/>
             <wp:cNvGraphicFramePr>
@@ -2156,7 +1761,7 @@
                   <pic:spPr>
                     <a:xfrm>
                       <a:off x="0" y="0"/>
-                      <a:ext cx="3650689" cy="4435740"/>
+                      <a:ext cx="4600000" cy="4629639"/>
                     </a:xfrm>
                     <a:prstGeom prst="rect">
                       <a:avLst/>
@@ -2221,27 +1826,15 @@
           <w:lang w:eastAsia="es-ES_tradnl"/>
         </w:rPr>
       </w:pPr>
-      <w:proofErr w:type="spellStart"/>
-      <w:r>
-        <w:rPr>
-          <w:rFonts w:eastAsia="Times New Roman" w:cstheme="minorHAnsi"/>
-          <w:color w:val="767171" w:themeColor="background2" w:themeShade="80"/>
-          <w:sz w:val="20"/>
-          <w:szCs w:val="20"/>
-          <w:lang w:eastAsia="es-ES_tradnl"/>
-        </w:rPr>
-        <w:t>Prompt</w:t>
-      </w:r>
-      <w:proofErr w:type="spellEnd"/>
-      <w:r>
-        <w:rPr>
-          <w:rFonts w:eastAsia="Times New Roman" w:cstheme="minorHAnsi"/>
-          <w:color w:val="767171" w:themeColor="background2" w:themeShade="80"/>
-          <w:sz w:val="20"/>
-          <w:szCs w:val="20"/>
-          <w:lang w:eastAsia="es-ES_tradnl"/>
-        </w:rPr>
-        <w:t xml:space="preserve"> principal: </w:t>
+      <w:r>
+        <w:rPr>
+          <w:rFonts w:eastAsia="Times New Roman" w:cstheme="minorHAnsi"/>
+          <w:color w:val="767171" w:themeColor="background2" w:themeShade="80"/>
+          <w:sz w:val="20"/>
+          <w:szCs w:val="20"/>
+          <w:lang w:eastAsia="es-ES_tradnl"/>
+        </w:rPr>
+        <w:t xml:space="preserve">Prompt principal: </w:t>
       </w:r>
     </w:p>
     <w:p>
@@ -2264,39 +1857,7 @@
           <w:szCs w:val="20"/>
           <w:lang w:eastAsia="es-ES_tradnl"/>
         </w:rPr>
-        <w:t>“</w:t>
-      </w:r>
-      <w:r>
-        <w:rPr>
-          <w:rFonts w:eastAsia="Times New Roman" w:cstheme="minorHAnsi"/>
-          <w:color w:val="767171" w:themeColor="background2" w:themeShade="80"/>
-          <w:sz w:val="20"/>
-          <w:szCs w:val="20"/>
-          <w:lang w:eastAsia="es-ES_tradnl"/>
-        </w:rPr>
-        <w:t xml:space="preserve">Actúa como un arquitecto de software especializado en patrones de diseño </w:t>
-      </w:r>
-      <w:proofErr w:type="spellStart"/>
-      <w:r>
-        <w:rPr>
-          <w:rFonts w:eastAsia="Times New Roman" w:cstheme="minorHAnsi"/>
-          <w:color w:val="767171" w:themeColor="background2" w:themeShade="80"/>
-          <w:sz w:val="20"/>
-          <w:szCs w:val="20"/>
-          <w:lang w:eastAsia="es-ES_tradnl"/>
-        </w:rPr>
-        <w:t>GoF</w:t>
-      </w:r>
-      <w:proofErr w:type="spellEnd"/>
-      <w:r>
-        <w:rPr>
-          <w:rFonts w:eastAsia="Times New Roman" w:cstheme="minorHAnsi"/>
-          <w:color w:val="767171" w:themeColor="background2" w:themeShade="80"/>
-          <w:sz w:val="20"/>
-          <w:szCs w:val="20"/>
-          <w:lang w:eastAsia="es-ES_tradnl"/>
-        </w:rPr>
-        <w:t xml:space="preserve"> y modelado UML. Estoy desarrollando una actividad académica de maestría sobre patrones estructurales. </w:t>
+        <w:t xml:space="preserve">“Actúa como un arquitecto de software especializado en patrones de diseño GoF y modelado UML. Estoy desarrollando una actividad académica de maestría sobre patrones estructurales. </w:t>
       </w:r>
     </w:p>
     <w:p>
@@ -2319,17 +1880,7 @@
           <w:szCs w:val="20"/>
           <w:lang w:eastAsia="es-ES_tradnl"/>
         </w:rPr>
-        <w:t>A</w:t>
-      </w:r>
-      <w:r>
-        <w:rPr>
-          <w:rFonts w:eastAsia="Times New Roman" w:cstheme="minorHAnsi"/>
-          <w:color w:val="767171" w:themeColor="background2" w:themeShade="80"/>
-          <w:sz w:val="20"/>
-          <w:szCs w:val="20"/>
-          <w:lang w:eastAsia="es-ES_tradnl"/>
-        </w:rPr>
-        <w:t xml:space="preserve">borda la gestión de presupuestos institucionales con niveles jerárquicos (partidas individuales y grupos anidados), he seleccionado el patrón </w:t>
+        <w:t xml:space="preserve">Aborda la gestión de presupuestos institucionales con niveles jerárquicos (partidas individuales y grupos anidados), he seleccionado el patrón </w:t>
       </w:r>
       <w:r>
         <w:rPr>
@@ -2432,51 +1983,7 @@
           <w:szCs w:val="20"/>
           <w:lang w:eastAsia="es-ES_tradnl"/>
         </w:rPr>
-        <w:t>2. Define los participantes estructurales del patrón (</w:t>
-      </w:r>
-      <w:proofErr w:type="spellStart"/>
-      <w:r>
-        <w:rPr>
-          <w:rFonts w:eastAsia="Times New Roman" w:cstheme="minorHAnsi"/>
-          <w:color w:val="767171" w:themeColor="background2" w:themeShade="80"/>
-          <w:sz w:val="20"/>
-          <w:szCs w:val="20"/>
-          <w:lang w:eastAsia="es-ES_tradnl"/>
-        </w:rPr>
-        <w:t>Component</w:t>
-      </w:r>
-      <w:proofErr w:type="spellEnd"/>
-      <w:r>
-        <w:rPr>
-          <w:rFonts w:eastAsia="Times New Roman" w:cstheme="minorHAnsi"/>
-          <w:color w:val="767171" w:themeColor="background2" w:themeShade="80"/>
-          <w:sz w:val="20"/>
-          <w:szCs w:val="20"/>
-          <w:lang w:eastAsia="es-ES_tradnl"/>
-        </w:rPr>
-        <w:t xml:space="preserve">, </w:t>
-      </w:r>
-      <w:proofErr w:type="spellStart"/>
-      <w:r>
-        <w:rPr>
-          <w:rFonts w:eastAsia="Times New Roman" w:cstheme="minorHAnsi"/>
-          <w:color w:val="767171" w:themeColor="background2" w:themeShade="80"/>
-          <w:sz w:val="20"/>
-          <w:szCs w:val="20"/>
-          <w:lang w:eastAsia="es-ES_tradnl"/>
-        </w:rPr>
-        <w:t>Leaf</w:t>
-      </w:r>
-      <w:proofErr w:type="spellEnd"/>
-      <w:r>
-        <w:rPr>
-          <w:rFonts w:eastAsia="Times New Roman" w:cstheme="minorHAnsi"/>
-          <w:color w:val="767171" w:themeColor="background2" w:themeShade="80"/>
-          <w:sz w:val="20"/>
-          <w:szCs w:val="20"/>
-          <w:lang w:eastAsia="es-ES_tradnl"/>
-        </w:rPr>
-        <w:t xml:space="preserve"> y Composite) aplicados al dominio presupuestario. </w:t>
+        <w:t xml:space="preserve">2. Define los participantes estructurales del patrón (Component, Leaf y Composite) aplicados al dominio presupuestario. </w:t>
       </w:r>
     </w:p>
     <w:p>
@@ -2499,29 +2006,7 @@
           <w:szCs w:val="20"/>
           <w:lang w:eastAsia="es-ES_tradnl"/>
         </w:rPr>
-        <w:t xml:space="preserve">3. Propone el diagrama de clases en formato </w:t>
-      </w:r>
-      <w:proofErr w:type="spellStart"/>
-      <w:r>
-        <w:rPr>
-          <w:rFonts w:eastAsia="Times New Roman" w:cstheme="minorHAnsi"/>
-          <w:color w:val="767171" w:themeColor="background2" w:themeShade="80"/>
-          <w:sz w:val="20"/>
-          <w:szCs w:val="20"/>
-          <w:lang w:eastAsia="es-ES_tradnl"/>
-        </w:rPr>
-        <w:t>Mermaid</w:t>
-      </w:r>
-      <w:proofErr w:type="spellEnd"/>
-      <w:r>
-        <w:rPr>
-          <w:rFonts w:eastAsia="Times New Roman" w:cstheme="minorHAnsi"/>
-          <w:color w:val="767171" w:themeColor="background2" w:themeShade="80"/>
-          <w:sz w:val="20"/>
-          <w:szCs w:val="20"/>
-          <w:lang w:eastAsia="es-ES_tradnl"/>
-        </w:rPr>
-        <w:t xml:space="preserve"> manteniendo correspondencia estricta con los requerimientos de cálculo recursivo y uniformidad operativa. 4. Considera la integración de procesamiento concurrente opcional para subárboles de presupuesto. </w:t>
+        <w:t xml:space="preserve">3. Propone el diagrama de clases en formato Mermaid manteniendo correspondencia estricta con los requerimientos de cálculo recursivo y uniformidad operativa. 4. Considera la integración de procesamiento concurrente opcional para subárboles de presupuesto. </w:t>
       </w:r>
     </w:p>
     <w:p>
@@ -2583,17 +2068,7 @@
           <w:szCs w:val="20"/>
           <w:lang w:eastAsia="es-ES_tradnl"/>
         </w:rPr>
-        <w:t>Utiliza un rigor técnico acorde a un nivel de posgrado/maestría</w:t>
-      </w:r>
-      <w:r>
-        <w:rPr>
-          <w:rFonts w:eastAsia="Times New Roman" w:cstheme="minorHAnsi"/>
-          <w:color w:val="767171" w:themeColor="background2" w:themeShade="80"/>
-          <w:sz w:val="20"/>
-          <w:szCs w:val="20"/>
-          <w:lang w:eastAsia="es-ES_tradnl"/>
-        </w:rPr>
-        <w:t>.</w:t>
+        <w:t>Utiliza un rigor técnico acorde a un nivel de posgrado/maestría.</w:t>
       </w:r>
     </w:p>
     <w:p>
@@ -2687,29 +2162,7 @@
           <w:szCs w:val="20"/>
           <w:lang w:eastAsia="es-ES_tradnl"/>
         </w:rPr>
-        <w:t xml:space="preserve">La sugerencia de unificar los métodos de impresión de estructura utilizando un parámetro de </w:t>
-      </w:r>
-      <w:proofErr w:type="spellStart"/>
-      <w:r>
-        <w:rPr>
-          <w:rFonts w:eastAsia="Times New Roman" w:cstheme="minorHAnsi"/>
-          <w:color w:val="767171" w:themeColor="background2" w:themeShade="80"/>
-          <w:sz w:val="20"/>
-          <w:szCs w:val="20"/>
-          <w:lang w:eastAsia="es-ES_tradnl"/>
-        </w:rPr>
-        <w:t>indentación</w:t>
-      </w:r>
-      <w:proofErr w:type="spellEnd"/>
-      <w:r>
-        <w:rPr>
-          <w:rFonts w:eastAsia="Times New Roman" w:cstheme="minorHAnsi"/>
-          <w:color w:val="767171" w:themeColor="background2" w:themeShade="80"/>
-          <w:sz w:val="20"/>
-          <w:szCs w:val="20"/>
-          <w:lang w:eastAsia="es-ES_tradnl"/>
-        </w:rPr>
-        <w:t xml:space="preserve"> (String nivel). </w:t>
+        <w:t xml:space="preserve">La sugerencia de unificar los métodos de impresión de estructura utilizando un parámetro de indentación (String nivel). </w:t>
       </w:r>
     </w:p>
     <w:p>
@@ -2921,51 +2374,7 @@
           <w:szCs w:val="20"/>
           <w:lang w:eastAsia="es-ES_tradnl"/>
         </w:rPr>
-        <w:t xml:space="preserve">Se modificó para mantener dichos métodos exclusivamente en la clase </w:t>
-      </w:r>
-      <w:proofErr w:type="spellStart"/>
-      <w:r>
-        <w:rPr>
-          <w:rFonts w:eastAsia="Times New Roman" w:cstheme="minorHAnsi"/>
-          <w:color w:val="767171" w:themeColor="background2" w:themeShade="80"/>
-          <w:sz w:val="20"/>
-          <w:szCs w:val="20"/>
-          <w:lang w:eastAsia="es-ES_tradnl"/>
-        </w:rPr>
-        <w:t>GrupoPresupuestario</w:t>
-      </w:r>
-      <w:proofErr w:type="spellEnd"/>
-      <w:r>
-        <w:rPr>
-          <w:rFonts w:eastAsia="Times New Roman" w:cstheme="minorHAnsi"/>
-          <w:color w:val="767171" w:themeColor="background2" w:themeShade="80"/>
-          <w:sz w:val="20"/>
-          <w:szCs w:val="20"/>
-          <w:lang w:eastAsia="es-ES_tradnl"/>
-        </w:rPr>
-        <w:t xml:space="preserve"> (Composite), siguiendo estrictamente los principios de diseño seguro de </w:t>
-      </w:r>
-      <w:proofErr w:type="spellStart"/>
-      <w:r>
-        <w:rPr>
-          <w:rFonts w:eastAsia="Times New Roman" w:cstheme="minorHAnsi"/>
-          <w:color w:val="767171" w:themeColor="background2" w:themeShade="80"/>
-          <w:sz w:val="20"/>
-          <w:szCs w:val="20"/>
-          <w:lang w:eastAsia="es-ES_tradnl"/>
-        </w:rPr>
-        <w:t>GoF</w:t>
-      </w:r>
-      <w:proofErr w:type="spellEnd"/>
-      <w:r>
-        <w:rPr>
-          <w:rFonts w:eastAsia="Times New Roman" w:cstheme="minorHAnsi"/>
-          <w:color w:val="767171" w:themeColor="background2" w:themeShade="80"/>
-          <w:sz w:val="20"/>
-          <w:szCs w:val="20"/>
-          <w:lang w:eastAsia="es-ES_tradnl"/>
-        </w:rPr>
-        <w:t xml:space="preserve"> para evitar que las hojas expongan operaciones de contenedores que no soportan.</w:t>
+        <w:t xml:space="preserve">Se modificó para mantener dichos métodos exclusivamente en la clase GrupoPresupuestario (Composite), siguiendo estrictamente los principios de diseño seguro de GoF para evitar que las hojas expongan operaciones de contenedores que no soportan.</w:t>
       </w:r>
     </w:p>
     <w:p>
@@ -3068,31 +2477,8 @@
           <w:sz w:val="20"/>
           <w:szCs w:val="20"/>
         </w:rPr>
-        <w:t>Justificación</w:t>
-      </w:r>
-      <w:r>
-        <w:rPr>
-          <w:rFonts w:eastAsiaTheme="majorEastAsia" w:cstheme="minorHAnsi"/>
-          <w:b/>
-          <w:bCs/>
-          <w:color w:val="2F5496" w:themeColor="accent1" w:themeShade="BF"/>
-          <w:sz w:val="20"/>
-          <w:szCs w:val="20"/>
-        </w:rPr>
-        <w:t xml:space="preserve"> (</w:t>
-      </w:r>
-      <w:r>
-        <w:rPr>
-          <w:rFonts w:eastAsiaTheme="majorEastAsia" w:cstheme="minorHAnsi"/>
-          <w:b/>
-          <w:bCs/>
-          <w:color w:val="2F5496" w:themeColor="accent1" w:themeShade="BF"/>
-          <w:sz w:val="20"/>
-          <w:szCs w:val="20"/>
-        </w:rPr>
-        <w:t xml:space="preserve">Gamma, E. et al. (1994) – </w:t>
-      </w:r>
-      <w:proofErr w:type="spellStart"/>
+        <w:t xml:space="preserve">Justificación (Gamma, E. et al. (1994) – </w:t>
+      </w:r>
       <w:r>
         <w:rPr>
           <w:rFonts w:eastAsiaTheme="majorEastAsia" w:cstheme="minorHAnsi"/>
@@ -3104,90 +2490,7 @@
           <w:sz w:val="20"/>
           <w:szCs w:val="20"/>
         </w:rPr>
-        <w:t>Design</w:t>
-      </w:r>
-      <w:proofErr w:type="spellEnd"/>
-      <w:r>
-        <w:rPr>
-          <w:rFonts w:eastAsiaTheme="majorEastAsia" w:cstheme="minorHAnsi"/>
-          <w:b/>
-          <w:bCs/>
-          <w:i/>
-          <w:iCs/>
-          <w:color w:val="2F5496" w:themeColor="accent1" w:themeShade="BF"/>
-          <w:sz w:val="20"/>
-          <w:szCs w:val="20"/>
-        </w:rPr>
-        <w:t xml:space="preserve"> </w:t>
-      </w:r>
-      <w:proofErr w:type="spellStart"/>
-      <w:r>
-        <w:rPr>
-          <w:rFonts w:eastAsiaTheme="majorEastAsia" w:cstheme="minorHAnsi"/>
-          <w:b/>
-          <w:bCs/>
-          <w:i/>
-          <w:iCs/>
-          <w:color w:val="2F5496" w:themeColor="accent1" w:themeShade="BF"/>
-          <w:sz w:val="20"/>
-          <w:szCs w:val="20"/>
-        </w:rPr>
-        <w:t>Patterns</w:t>
-      </w:r>
-      <w:proofErr w:type="spellEnd"/>
-      <w:r>
-        <w:rPr>
-          <w:rFonts w:eastAsiaTheme="majorEastAsia" w:cstheme="minorHAnsi"/>
-          <w:b/>
-          <w:bCs/>
-          <w:i/>
-          <w:iCs/>
-          <w:color w:val="2F5496" w:themeColor="accent1" w:themeShade="BF"/>
-          <w:sz w:val="20"/>
-          <w:szCs w:val="20"/>
-        </w:rPr>
-        <w:t xml:space="preserve"> (</w:t>
-      </w:r>
-      <w:proofErr w:type="spellStart"/>
-      <w:r>
-        <w:rPr>
-          <w:rFonts w:eastAsiaTheme="majorEastAsia" w:cstheme="minorHAnsi"/>
-          <w:b/>
-          <w:bCs/>
-          <w:i/>
-          <w:iCs/>
-          <w:color w:val="2F5496" w:themeColor="accent1" w:themeShade="BF"/>
-          <w:sz w:val="20"/>
-          <w:szCs w:val="20"/>
-        </w:rPr>
-        <w:t>GoF</w:t>
-      </w:r>
-      <w:proofErr w:type="spellEnd"/>
-      <w:r>
-        <w:rPr>
-          <w:rFonts w:eastAsiaTheme="majorEastAsia" w:cstheme="minorHAnsi"/>
-          <w:b/>
-          <w:bCs/>
-          <w:i/>
-          <w:iCs/>
-          <w:color w:val="2F5496" w:themeColor="accent1" w:themeShade="BF"/>
-          <w:sz w:val="20"/>
-          <w:szCs w:val="20"/>
-        </w:rPr>
-        <w:t>)</w:t>
-      </w:r>
-      <w:r>
-        <w:rPr>
-          <w:rFonts w:eastAsiaTheme="majorEastAsia" w:cstheme="minorHAnsi"/>
-          <w:b/>
-          <w:bCs/>
-          <w:i/>
-          <w:iCs/>
-          <w:color w:val="2F5496" w:themeColor="accent1" w:themeShade="BF"/>
-          <w:sz w:val="20"/>
-          <w:szCs w:val="20"/>
-        </w:rPr>
-        <w:t>)</w:t>
+        <w:t xml:space="preserve">Design Patterns (GoF))</w:t>
       </w:r>
     </w:p>
     <w:p>
@@ -3251,7 +2554,7 @@
           <w:szCs w:val="20"/>
           <w:lang w:eastAsia="es-ES_tradnl"/>
         </w:rPr>
-        <w:t>La universidad dispone de un sistema institucional con un contrato de asistencia establecido. La llegada de nuevos dispositivos biométricos de un fabricante diferente introduce una interfaz incompatible basada en colecciones y métodos propios que no coinciden con el estándar operativo interno. Modificar el sistema raíz violaría el desacoplamiento y crear acoplamiento con proveedores externos.</w:t>
+        <w:t>La universidad dispone de un sistema institucional con un contrato de asistencia establecido. La llegada de nuevos dispositivos biométricos de un fabricante diferente introduce una interfaz incompatible basada en colecciones y métodos propios que no coinciden con el estándar operativo interno. Modificar el sistema raíz violaría el desacoplamiento y crearía acoplamiento con proveedores externos.</w:t>
       </w:r>
     </w:p>
     <w:p>
@@ -3317,51 +2620,7 @@
           <w:szCs w:val="20"/>
           <w:lang w:eastAsia="es-ES_tradnl"/>
         </w:rPr>
-        <w:t xml:space="preserve">Se selecciona el patrón </w:t>
-      </w:r>
-      <w:proofErr w:type="spellStart"/>
-      <w:r>
-        <w:rPr>
-          <w:rFonts w:eastAsia="Times New Roman" w:cstheme="minorHAnsi"/>
-          <w:color w:val="767171" w:themeColor="background2" w:themeShade="80"/>
-          <w:sz w:val="20"/>
-          <w:szCs w:val="20"/>
-          <w:lang w:eastAsia="es-ES_tradnl"/>
-        </w:rPr>
-        <w:t>Adapter</w:t>
-      </w:r>
-      <w:proofErr w:type="spellEnd"/>
-      <w:r>
-        <w:rPr>
-          <w:rFonts w:eastAsia="Times New Roman" w:cstheme="minorHAnsi"/>
-          <w:color w:val="767171" w:themeColor="background2" w:themeShade="80"/>
-          <w:sz w:val="20"/>
-          <w:szCs w:val="20"/>
-          <w:lang w:eastAsia="es-ES_tradnl"/>
-        </w:rPr>
-        <w:t xml:space="preserve"> (Patrón Estructural </w:t>
-      </w:r>
-      <w:proofErr w:type="spellStart"/>
-      <w:r>
-        <w:rPr>
-          <w:rFonts w:eastAsia="Times New Roman" w:cstheme="minorHAnsi"/>
-          <w:color w:val="767171" w:themeColor="background2" w:themeShade="80"/>
-          <w:sz w:val="20"/>
-          <w:szCs w:val="20"/>
-          <w:lang w:eastAsia="es-ES_tradnl"/>
-        </w:rPr>
-        <w:t>GoF</w:t>
-      </w:r>
-      <w:proofErr w:type="spellEnd"/>
-      <w:r>
-        <w:rPr>
-          <w:rFonts w:eastAsia="Times New Roman" w:cstheme="minorHAnsi"/>
-          <w:color w:val="767171" w:themeColor="background2" w:themeShade="80"/>
-          <w:sz w:val="20"/>
-          <w:szCs w:val="20"/>
-          <w:lang w:eastAsia="es-ES_tradnl"/>
-        </w:rPr>
-        <w:t>).</w:t>
+        <w:t xml:space="preserve">Se selecciona el patrón Adapter (Patrón Estructural GoF).</w:t>
       </w:r>
     </w:p>
     <w:p>
@@ -3500,33 +2759,7 @@
           <w:szCs w:val="20"/>
           <w:lang w:eastAsia="es-ES_tradnl"/>
         </w:rPr>
-        <w:t>Target (</w:t>
-      </w:r>
-      <w:proofErr w:type="spellStart"/>
-      <w:r>
-        <w:rPr>
-          <w:rFonts w:eastAsia="Times New Roman" w:cstheme="minorHAnsi"/>
-          <w:b/>
-          <w:bCs/>
-          <w:color w:val="767171" w:themeColor="background2" w:themeShade="80"/>
-          <w:sz w:val="20"/>
-          <w:szCs w:val="20"/>
-          <w:lang w:eastAsia="es-ES_tradnl"/>
-        </w:rPr>
-        <w:t>ISistemaAsistencia</w:t>
-      </w:r>
-      <w:proofErr w:type="spellEnd"/>
-      <w:r>
-        <w:rPr>
-          <w:rFonts w:eastAsia="Times New Roman" w:cstheme="minorHAnsi"/>
-          <w:b/>
-          <w:bCs/>
-          <w:color w:val="767171" w:themeColor="background2" w:themeShade="80"/>
-          <w:sz w:val="20"/>
-          <w:szCs w:val="20"/>
-          <w:lang w:eastAsia="es-ES_tradnl"/>
-        </w:rPr>
-        <w:t xml:space="preserve">): </w:t>
+        <w:t xml:space="preserve">Target (ISistemaAsistencia): </w:t>
       </w:r>
     </w:p>
     <w:p>
@@ -3567,67 +2800,17 @@
           <w:lang w:eastAsia="es-ES_tradnl"/>
         </w:rPr>
       </w:pPr>
-      <w:proofErr w:type="spellStart"/>
-      <w:r>
-        <w:rPr>
-          <w:rFonts w:eastAsia="Times New Roman" w:cstheme="minorHAnsi"/>
-          <w:b/>
-          <w:bCs/>
-          <w:color w:val="767171" w:themeColor="background2" w:themeShade="80"/>
-          <w:sz w:val="20"/>
-          <w:szCs w:val="20"/>
-          <w:lang w:eastAsia="es-ES_tradnl"/>
-        </w:rPr>
-        <w:t>Adaptee</w:t>
-      </w:r>
-      <w:proofErr w:type="spellEnd"/>
-      <w:r>
-        <w:rPr>
-          <w:rFonts w:eastAsia="Times New Roman" w:cstheme="minorHAnsi"/>
-          <w:b/>
-          <w:bCs/>
-          <w:color w:val="767171" w:themeColor="background2" w:themeShade="80"/>
-          <w:sz w:val="20"/>
-          <w:szCs w:val="20"/>
-          <w:lang w:eastAsia="es-ES_tradnl"/>
-        </w:rPr>
-        <w:t xml:space="preserve"> / Adaptado (</w:t>
-      </w:r>
-      <w:proofErr w:type="spellStart"/>
-      <w:r>
-        <w:rPr>
-          <w:rFonts w:eastAsia="Times New Roman" w:cstheme="minorHAnsi"/>
-          <w:b/>
-          <w:bCs/>
-          <w:color w:val="767171" w:themeColor="background2" w:themeShade="80"/>
-          <w:sz w:val="20"/>
-          <w:szCs w:val="20"/>
-          <w:lang w:eastAsia="es-ES_tradnl"/>
-        </w:rPr>
-        <w:t>BibliotecaBiometricaExterna</w:t>
-      </w:r>
-      <w:proofErr w:type="spellEnd"/>
-      <w:r>
-        <w:rPr>
-          <w:rFonts w:eastAsia="Times New Roman" w:cstheme="minorHAnsi"/>
-          <w:b/>
-          <w:bCs/>
-          <w:color w:val="767171" w:themeColor="background2" w:themeShade="80"/>
-          <w:sz w:val="20"/>
-          <w:szCs w:val="20"/>
-          <w:lang w:eastAsia="es-ES_tradnl"/>
-        </w:rPr>
-        <w:t>):</w:t>
-      </w:r>
-      <w:r>
-        <w:rPr>
-          <w:rFonts w:eastAsia="Times New Roman" w:cstheme="minorHAnsi"/>
-          <w:color w:val="767171" w:themeColor="background2" w:themeShade="80"/>
-          <w:sz w:val="20"/>
-          <w:szCs w:val="20"/>
-          <w:lang w:eastAsia="es-ES_tradnl"/>
-        </w:rPr>
-        <w:t xml:space="preserve"> </w:t>
+      <w:r>
+        <w:rPr>
+          <w:rFonts w:eastAsia="Times New Roman" w:cstheme="minorHAnsi"/>
+          <w:b/>
+          <w:bCs/>
+          <w:color w:val="767171" w:themeColor="background2" w:themeShade="80"/>
+          <w:sz w:val="20"/>
+          <w:szCs w:val="20"/>
+          <w:lang w:eastAsia="es-ES_tradnl"/>
+        </w:rPr>
+        <w:t xml:space="preserve">Adaptee / Adaptado (BibliotecaBiometricaLegacy, CloudBiometricApi): </w:t>
       </w:r>
     </w:p>
     <w:p>
@@ -3650,7 +2833,7 @@
           <w:szCs w:val="20"/>
           <w:lang w:eastAsia="es-ES_tradnl"/>
         </w:rPr>
-        <w:t>La clase de terceros con métodos y estructuras incompatibles.</w:t>
+        <w:t xml:space="preserve">Bibliotecas de terceros, no modificables, con operaciones y tipos propios: getLogsOld(int) devuelve en texto plano todas las marcaciones de un código numérico y fetchUserData(String) recibe una consulta JSON y devuelve un JsonObject con horas en formato ISO-8601.</w:t>
       </w:r>
     </w:p>
     <w:p>
@@ -3681,57 +2864,17 @@
           <w:lang w:eastAsia="es-ES_tradnl"/>
         </w:rPr>
       </w:pPr>
-      <w:proofErr w:type="spellStart"/>
-      <w:r>
-        <w:rPr>
-          <w:rFonts w:eastAsia="Times New Roman" w:cstheme="minorHAnsi"/>
-          <w:b/>
-          <w:bCs/>
-          <w:color w:val="767171" w:themeColor="background2" w:themeShade="80"/>
-          <w:sz w:val="20"/>
-          <w:szCs w:val="20"/>
-          <w:lang w:eastAsia="es-ES_tradnl"/>
-        </w:rPr>
-        <w:t>Adapter</w:t>
-      </w:r>
-      <w:proofErr w:type="spellEnd"/>
-      <w:r>
-        <w:rPr>
-          <w:rFonts w:eastAsia="Times New Roman" w:cstheme="minorHAnsi"/>
-          <w:b/>
-          <w:bCs/>
-          <w:color w:val="767171" w:themeColor="background2" w:themeShade="80"/>
-          <w:sz w:val="20"/>
-          <w:szCs w:val="20"/>
-          <w:lang w:eastAsia="es-ES_tradnl"/>
-        </w:rPr>
-        <w:t xml:space="preserve"> (</w:t>
-      </w:r>
-      <w:proofErr w:type="spellStart"/>
-      <w:r>
-        <w:rPr>
-          <w:rFonts w:eastAsia="Times New Roman" w:cstheme="minorHAnsi"/>
-          <w:b/>
-          <w:bCs/>
-          <w:color w:val="767171" w:themeColor="background2" w:themeShade="80"/>
-          <w:sz w:val="20"/>
-          <w:szCs w:val="20"/>
-          <w:lang w:eastAsia="es-ES_tradnl"/>
-        </w:rPr>
-        <w:t>BiometricoAdapter</w:t>
-      </w:r>
-      <w:proofErr w:type="spellEnd"/>
-      <w:r>
-        <w:rPr>
-          <w:rFonts w:eastAsia="Times New Roman" w:cstheme="minorHAnsi"/>
-          <w:b/>
-          <w:bCs/>
-          <w:color w:val="767171" w:themeColor="background2" w:themeShade="80"/>
-          <w:sz w:val="20"/>
-          <w:szCs w:val="20"/>
-          <w:lang w:eastAsia="es-ES_tradnl"/>
-        </w:rPr>
-        <w:t xml:space="preserve">): </w:t>
+      <w:r>
+        <w:rPr>
+          <w:rFonts w:eastAsia="Times New Roman" w:cstheme="minorHAnsi"/>
+          <w:b/>
+          <w:bCs/>
+          <w:color w:val="767171" w:themeColor="background2" w:themeShade="80"/>
+          <w:sz w:val="20"/>
+          <w:szCs w:val="20"/>
+          <w:lang w:eastAsia="es-ES_tradnl"/>
+        </w:rPr>
+        <w:t xml:space="preserve">Adapter (BiometricoLegacyAdapter, BiometricoNuevoAdapter): </w:t>
       </w:r>
     </w:p>
     <w:p>
@@ -3754,29 +2897,7 @@
           <w:szCs w:val="20"/>
           <w:lang w:eastAsia="es-ES_tradnl"/>
         </w:rPr>
-        <w:t xml:space="preserve">Implementa el Target y envuelve al </w:t>
-      </w:r>
-      <w:proofErr w:type="spellStart"/>
-      <w:r>
-        <w:rPr>
-          <w:rFonts w:eastAsia="Times New Roman" w:cstheme="minorHAnsi"/>
-          <w:color w:val="767171" w:themeColor="background2" w:themeShade="80"/>
-          <w:sz w:val="20"/>
-          <w:szCs w:val="20"/>
-          <w:lang w:eastAsia="es-ES_tradnl"/>
-        </w:rPr>
-        <w:t>Adaptee</w:t>
-      </w:r>
-      <w:proofErr w:type="spellEnd"/>
-      <w:r>
-        <w:rPr>
-          <w:rFonts w:eastAsia="Times New Roman" w:cstheme="minorHAnsi"/>
-          <w:color w:val="767171" w:themeColor="background2" w:themeShade="80"/>
-          <w:sz w:val="20"/>
-          <w:szCs w:val="20"/>
-          <w:lang w:eastAsia="es-ES_tradnl"/>
-        </w:rPr>
-        <w:t>, traduciendo las llamadas y transformando las estructuras de datos devueltas.</w:t>
+        <w:t xml:space="preserve">Implementan el Target y contienen por composición a su Adaptee (Adapter de objetos). Traducen los parámetros (identificador a código numérico, fecha a formato yyyyMMdd o consulta JSON) y transforman cada respuesta propietaria en un RegistroNormalizado.</w:t>
       </w:r>
     </w:p>
     <w:p>
@@ -3806,50 +2927,20 @@
           <w:color w:val="767171" w:themeColor="background2" w:themeShade="80"/>
           <w:sz w:val="20"/>
           <w:szCs w:val="20"/>
-          <w:u w:val="single"/>
-          <w:lang w:eastAsia="es-ES_tradnl"/>
-        </w:rPr>
-      </w:pPr>
-      <w:r>
-        <w:rPr>
-          <w:rFonts w:eastAsia="Times New Roman" w:cstheme="minorHAnsi"/>
-          <w:b/>
-          <w:bCs/>
-          <w:color w:val="767171" w:themeColor="background2" w:themeShade="80"/>
-          <w:sz w:val="20"/>
-          <w:szCs w:val="20"/>
-          <w:u w:val="single"/>
-          <w:lang w:eastAsia="es-ES_tradnl"/>
-        </w:rPr>
-        <w:t>Cliente (</w:t>
-      </w:r>
-      <w:proofErr w:type="spellStart"/>
-      <w:r>
-        <w:rPr>
-          <w:rFonts w:eastAsia="Times New Roman" w:cstheme="minorHAnsi"/>
-          <w:b/>
-          <w:bCs/>
-          <w:color w:val="767171" w:themeColor="background2" w:themeShade="80"/>
-          <w:sz w:val="20"/>
-          <w:szCs w:val="20"/>
-          <w:u w:val="single"/>
-          <w:lang w:eastAsia="es-ES_tradnl"/>
-        </w:rPr>
-        <w:t>SistemaUniversitario</w:t>
-      </w:r>
-      <w:proofErr w:type="spellEnd"/>
-      <w:r>
-        <w:rPr>
-          <w:rFonts w:eastAsia="Times New Roman" w:cstheme="minorHAnsi"/>
-          <w:b/>
-          <w:bCs/>
-          <w:color w:val="767171" w:themeColor="background2" w:themeShade="80"/>
-          <w:sz w:val="20"/>
-          <w:szCs w:val="20"/>
-          <w:u w:val="single"/>
-          <w:lang w:eastAsia="es-ES_tradnl"/>
-        </w:rPr>
-        <w:t xml:space="preserve">): </w:t>
+          <w:lang w:eastAsia="es-ES_tradnl"/>
+        </w:rPr>
+      </w:pPr>
+      <w:r>
+        <w:rPr>
+          <w:rFonts w:eastAsia="Times New Roman" w:cstheme="minorHAnsi"/>
+          <w:b/>
+          <w:bCs/>
+          <w:color w:val="767171" w:themeColor="background2" w:themeShade="80"/>
+          <w:sz w:val="20"/>
+          <w:szCs w:val="20"/>
+          <w:lang w:eastAsia="es-ES_tradnl"/>
+        </w:rPr>
+        <w:t xml:space="preserve">Cliente (MainAsistenciaConcurrente): </w:t>
       </w:r>
     </w:p>
     <w:p>
@@ -3872,7 +2963,7 @@
           <w:szCs w:val="20"/>
           <w:lang w:eastAsia="es-ES_tradnl"/>
         </w:rPr>
-        <w:t>Interactúa exclusivamente con objetos que satisfacen la interfaz Target.</w:t>
+        <w:t xml:space="preserve">Interactúa exclusivamente con la interfaz ISistemaAsistencia y con RegistroNormalizado; consulta varios adaptadores en paralelo sin conocer las particularidades de cada fabricante.</w:t>
       </w:r>
     </w:p>
     <w:p>
@@ -3937,29 +3028,7 @@
           <w:szCs w:val="20"/>
         </w:rPr>
         <w:lastRenderedPageBreak/>
-        <w:t xml:space="preserve">Diagrama </w:t>
-      </w:r>
-      <w:r>
-        <w:rPr>
-          <w:rFonts w:eastAsiaTheme="majorEastAsia" w:cstheme="minorHAnsi"/>
-          <w:b/>
-          <w:bCs/>
-          <w:color w:val="2F5496" w:themeColor="accent1" w:themeShade="BF"/>
-          <w:sz w:val="20"/>
-          <w:szCs w:val="20"/>
-        </w:rPr>
-        <w:t>(</w:t>
-      </w:r>
-      <w:r>
-        <w:rPr>
-          <w:rFonts w:eastAsiaTheme="majorEastAsia" w:cstheme="minorHAnsi"/>
-          <w:b/>
-          <w:bCs/>
-          <w:color w:val="2F5496" w:themeColor="accent1" w:themeShade="BF"/>
-          <w:sz w:val="20"/>
-          <w:szCs w:val="20"/>
-        </w:rPr>
-        <w:t xml:space="preserve">Fowler, M. (2004) – </w:t>
+        <w:t xml:space="preserve">Diagrama (Fowler, M. (2004) – </w:t>
       </w:r>
       <w:r>
         <w:rPr>
@@ -3972,24 +3041,22 @@
           <w:sz w:val="20"/>
           <w:szCs w:val="20"/>
         </w:rPr>
-        <w:t xml:space="preserve">UML </w:t>
-      </w:r>
-      <w:proofErr w:type="spellStart"/>
+        <w:t xml:space="preserve">UML Distilled</w:t>
+      </w:r>
       <w:r>
         <w:rPr>
           <w:rFonts w:eastAsiaTheme="majorEastAsia" w:cstheme="minorHAnsi"/>
           <w:b/>
           <w:bCs/>
-          <w:i/>
-          <w:iCs/>
           <w:color w:val="2F5496" w:themeColor="accent1" w:themeShade="BF"/>
           <w:sz w:val="20"/>
           <w:szCs w:val="20"/>
         </w:rPr>
-        <w:t>Distilled</w:t>
-      </w:r>
-      <w:proofErr w:type="spellEnd"/>
-      <w:r>
+        <w:t>.)</w:t>
+      </w:r>
+    </w:p>
+    <w:p>
+      <w:pPr>
         <w:rPr>
           <w:rFonts w:eastAsiaTheme="majorEastAsia" w:cstheme="minorHAnsi"/>
           <w:b/>
@@ -3998,11 +3065,8 @@
           <w:sz w:val="20"/>
           <w:szCs w:val="20"/>
         </w:rPr>
-        <w:t>.)</w:t>
-      </w:r>
-    </w:p>
-    <w:p>
-      <w:pPr>
+      </w:pPr>
+      <w:r>
         <w:rPr>
           <w:rFonts w:eastAsiaTheme="majorEastAsia" w:cstheme="minorHAnsi"/>
           <w:b/>
@@ -4011,41 +3075,7 @@
           <w:sz w:val="20"/>
           <w:szCs w:val="20"/>
         </w:rPr>
-      </w:pPr>
-      <w:r>
-        <w:rPr>
-          <w:rFonts w:eastAsiaTheme="majorEastAsia" w:cstheme="minorHAnsi"/>
-          <w:b/>
-          <w:bCs/>
-          <w:color w:val="2F5496" w:themeColor="accent1" w:themeShade="BF"/>
-          <w:sz w:val="20"/>
-          <w:szCs w:val="20"/>
-        </w:rPr>
-        <w:t xml:space="preserve">Diagrama Original (Estructura base del </w:t>
-      </w:r>
-      <w:proofErr w:type="spellStart"/>
-      <w:r>
-        <w:rPr>
-          <w:rFonts w:eastAsiaTheme="majorEastAsia" w:cstheme="minorHAnsi"/>
-          <w:b/>
-          <w:bCs/>
-          <w:color w:val="2F5496" w:themeColor="accent1" w:themeShade="BF"/>
-          <w:sz w:val="20"/>
-          <w:szCs w:val="20"/>
-        </w:rPr>
-        <w:t>Adapter</w:t>
-      </w:r>
-      <w:proofErr w:type="spellEnd"/>
-      <w:r>
-        <w:rPr>
-          <w:rFonts w:eastAsiaTheme="majorEastAsia" w:cstheme="minorHAnsi"/>
-          <w:b/>
-          <w:bCs/>
-          <w:color w:val="2F5496" w:themeColor="accent1" w:themeShade="BF"/>
-          <w:sz w:val="20"/>
-          <w:szCs w:val="20"/>
-        </w:rPr>
-        <w:t>)</w:t>
+        <w:t xml:space="preserve">Diagrama Original (Estructura base del Adapter)</w:t>
       </w:r>
     </w:p>
     <w:p>
@@ -4126,27 +3156,7 @@
           <w:sz w:val="20"/>
           <w:szCs w:val="20"/>
         </w:rPr>
-        <w:t xml:space="preserve">Figura 3: Diagrama Original (Estructura base del </w:t>
-      </w:r>
-      <w:proofErr w:type="spellStart"/>
-      <w:r>
-        <w:rPr>
-          <w:rFonts w:asciiTheme="minorHAnsi" w:hAnsiTheme="minorHAnsi" w:cstheme="minorHAnsi"/>
-          <w:color w:val="767171" w:themeColor="background2" w:themeShade="80"/>
-          <w:sz w:val="20"/>
-          <w:szCs w:val="20"/>
-        </w:rPr>
-        <w:t>Adapter</w:t>
-      </w:r>
-      <w:proofErr w:type="spellEnd"/>
-      <w:r>
-        <w:rPr>
-          <w:rFonts w:asciiTheme="minorHAnsi" w:hAnsiTheme="minorHAnsi" w:cstheme="minorHAnsi"/>
-          <w:color w:val="767171" w:themeColor="background2" w:themeShade="80"/>
-          <w:sz w:val="20"/>
-          <w:szCs w:val="20"/>
-        </w:rPr>
-        <w:t>)</w:t>
+        <w:t xml:space="preserve">Figura 3: Diagrama Original (Estructura base del Adapter)</w:t>
       </w:r>
     </w:p>
     <w:p>
@@ -4263,54 +3273,7 @@
           <w:sz w:val="20"/>
           <w:szCs w:val="20"/>
         </w:rPr>
-        <w:t xml:space="preserve">Figura </w:t>
-      </w:r>
-      <w:r>
-        <w:rPr>
-          <w:rFonts w:asciiTheme="minorHAnsi" w:hAnsiTheme="minorHAnsi" w:cstheme="minorHAnsi"/>
-          <w:color w:val="767171" w:themeColor="background2" w:themeShade="80"/>
-          <w:sz w:val="20"/>
-          <w:szCs w:val="20"/>
-        </w:rPr>
-        <w:t>4</w:t>
-      </w:r>
-      <w:r>
-        <w:rPr>
-          <w:rFonts w:asciiTheme="minorHAnsi" w:hAnsiTheme="minorHAnsi" w:cstheme="minorHAnsi"/>
-          <w:color w:val="767171" w:themeColor="background2" w:themeShade="80"/>
-          <w:sz w:val="20"/>
-          <w:szCs w:val="20"/>
-        </w:rPr>
-        <w:t xml:space="preserve">: Diagrama (Estructura base del </w:t>
-      </w:r>
-      <w:proofErr w:type="spellStart"/>
-      <w:r>
-        <w:rPr>
-          <w:rFonts w:asciiTheme="minorHAnsi" w:hAnsiTheme="minorHAnsi" w:cstheme="minorHAnsi"/>
-          <w:color w:val="767171" w:themeColor="background2" w:themeShade="80"/>
-          <w:sz w:val="20"/>
-          <w:szCs w:val="20"/>
-        </w:rPr>
-        <w:t>Adapter</w:t>
-      </w:r>
-      <w:proofErr w:type="spellEnd"/>
-      <w:r>
-        <w:rPr>
-          <w:rFonts w:asciiTheme="minorHAnsi" w:hAnsiTheme="minorHAnsi" w:cstheme="minorHAnsi"/>
-          <w:color w:val="767171" w:themeColor="background2" w:themeShade="80"/>
-          <w:sz w:val="20"/>
-          <w:szCs w:val="20"/>
-        </w:rPr>
-        <w:t>)</w:t>
-      </w:r>
-      <w:r>
-        <w:rPr>
-          <w:rFonts w:asciiTheme="minorHAnsi" w:hAnsiTheme="minorHAnsi" w:cstheme="minorHAnsi"/>
-          <w:color w:val="767171" w:themeColor="background2" w:themeShade="80"/>
-          <w:sz w:val="20"/>
-          <w:szCs w:val="20"/>
-        </w:rPr>
-        <w:t>, con cambios aceptados</w:t>
+        <w:t xml:space="preserve">Figura 4: Diagrama (Estructura base del Adapter), con cambios aceptados</w:t>
       </w:r>
     </w:p>
     <w:p>
@@ -4409,19 +3372,7 @@
           <w:szCs w:val="20"/>
           <w:lang w:eastAsia="en-US"/>
         </w:rPr>
-        <w:t>Ruta de clases java</w:t>
-      </w:r>
-      <w:r>
-        <w:rPr>
-          <w:rFonts w:asciiTheme="minorHAnsi" w:eastAsiaTheme="majorEastAsia" w:hAnsiTheme="minorHAnsi" w:cstheme="minorHAnsi"/>
-          <w:b/>
-          <w:bCs/>
-          <w:color w:val="2F5496" w:themeColor="accent1" w:themeShade="BF"/>
-          <w:sz w:val="20"/>
-          <w:szCs w:val="20"/>
-          <w:lang w:eastAsia="en-US"/>
-        </w:rPr>
-        <w:t xml:space="preserve"> escenario02 en repositorio: </w:t>
+        <w:t xml:space="preserve">Ruta de clases java escenario02 en repositorio: </w:t>
       </w:r>
       <w:hyperlink r:id="rId15" w:history="1">
         <w:r>
@@ -4466,7 +3417,7 @@
         </w:rPr>
         <w:drawing>
           <wp:inline distT="0" distB="0" distL="0" distR="0" wp14:anchorId="1698CCA6" wp14:editId="5ED07380">
-            <wp:extent cx="4108450" cy="4546635"/>
+            <wp:extent cx="4600000" cy="6205208"/>
             <wp:effectExtent l="0" t="0" r="6350" b="6350"/>
             <wp:docPr id="197346119" name="Imagen 1"/>
             <wp:cNvGraphicFramePr>
@@ -4488,7 +3439,7 @@
                   <pic:spPr>
                     <a:xfrm>
                       <a:off x="0" y="0"/>
-                      <a:ext cx="4111108" cy="4549577"/>
+                      <a:ext cx="4600000" cy="6205208"/>
                     </a:xfrm>
                     <a:prstGeom prst="rect">
                       <a:avLst/>
@@ -4550,7 +3501,6 @@
           <w:szCs w:val="20"/>
         </w:rPr>
       </w:pPr>
-      <w:proofErr w:type="spellStart"/>
       <w:r>
         <w:rPr>
           <w:rFonts w:asciiTheme="minorHAnsi" w:hAnsiTheme="minorHAnsi" w:cstheme="minorHAnsi"/>
@@ -4560,19 +3510,7 @@
           <w:sz w:val="20"/>
           <w:szCs w:val="20"/>
         </w:rPr>
-        <w:t>Prompt</w:t>
-      </w:r>
-      <w:proofErr w:type="spellEnd"/>
-      <w:r>
-        <w:rPr>
-          <w:rFonts w:asciiTheme="minorHAnsi" w:hAnsiTheme="minorHAnsi" w:cstheme="minorHAnsi"/>
-          <w:b/>
-          <w:bCs/>
-          <w:color w:val="767171" w:themeColor="background2" w:themeShade="80"/>
-          <w:sz w:val="20"/>
-          <w:szCs w:val="20"/>
-        </w:rPr>
-        <w:t xml:space="preserve"> principal: </w:t>
+        <w:t xml:space="preserve">Prompt principal: </w:t>
       </w:r>
     </w:p>
     <w:p>
@@ -4595,59 +3533,11 @@
           <w:sz w:val="20"/>
           <w:szCs w:val="20"/>
         </w:rPr>
-        <w:t>"</w:t>
+        <w:t xml:space="preserve">"Actúa como un arquitecto de software experto en integración de sistemas y patrones estructurales GoF. Estoy desarrollando una actividad académica de maestría. Donde una universidad debe integrar dispositivos biométricos de un nuevo fabricante con una interfaz propietaria incompatible sin alterar su contrato institucional de asistencia, he seleccionado el patrón </w:t>
       </w:r>
       <w:r>
         <w:rPr>
           <w:rFonts w:asciiTheme="minorHAnsi" w:hAnsiTheme="minorHAnsi" w:cstheme="minorHAnsi"/>
-          <w:color w:val="767171" w:themeColor="background2" w:themeShade="80"/>
-          <w:sz w:val="20"/>
-          <w:szCs w:val="20"/>
-        </w:rPr>
-        <w:t xml:space="preserve">Actúa como un arquitecto de software experto en integración de sistemas y patrones estructurales </w:t>
-      </w:r>
-      <w:proofErr w:type="spellStart"/>
-      <w:r>
-        <w:rPr>
-          <w:rFonts w:asciiTheme="minorHAnsi" w:hAnsiTheme="minorHAnsi" w:cstheme="minorHAnsi"/>
-          <w:color w:val="767171" w:themeColor="background2" w:themeShade="80"/>
-          <w:sz w:val="20"/>
-          <w:szCs w:val="20"/>
-        </w:rPr>
-        <w:t>GoF</w:t>
-      </w:r>
-      <w:proofErr w:type="spellEnd"/>
-      <w:r>
-        <w:rPr>
-          <w:rFonts w:asciiTheme="minorHAnsi" w:hAnsiTheme="minorHAnsi" w:cstheme="minorHAnsi"/>
-          <w:color w:val="767171" w:themeColor="background2" w:themeShade="80"/>
-          <w:sz w:val="20"/>
-          <w:szCs w:val="20"/>
-        </w:rPr>
-        <w:t xml:space="preserve">. Estoy desarrollando una actividad académica de maestría. </w:t>
-      </w:r>
-      <w:r>
-        <w:rPr>
-          <w:rFonts w:asciiTheme="minorHAnsi" w:hAnsiTheme="minorHAnsi" w:cstheme="minorHAnsi"/>
-          <w:color w:val="767171" w:themeColor="background2" w:themeShade="80"/>
-          <w:sz w:val="20"/>
-          <w:szCs w:val="20"/>
-        </w:rPr>
-        <w:t xml:space="preserve">Donde </w:t>
-      </w:r>
-      <w:r>
-        <w:rPr>
-          <w:rFonts w:asciiTheme="minorHAnsi" w:hAnsiTheme="minorHAnsi" w:cstheme="minorHAnsi"/>
-          <w:color w:val="767171" w:themeColor="background2" w:themeShade="80"/>
-          <w:sz w:val="20"/>
-          <w:szCs w:val="20"/>
-        </w:rPr>
-        <w:t xml:space="preserve">una universidad debe integrar dispositivos biométricos de un nuevo fabricante con una interfaz propietaria incompatible sin alterar su contrato institucional de asistencia, he seleccionado el patrón </w:t>
-      </w:r>
-      <w:proofErr w:type="spellStart"/>
-      <w:r>
-        <w:rPr>
-          <w:rFonts w:asciiTheme="minorHAnsi" w:hAnsiTheme="minorHAnsi" w:cstheme="minorHAnsi"/>
           <w:b/>
           <w:bCs/>
           <w:color w:val="767171" w:themeColor="background2" w:themeShade="80"/>
@@ -4656,7 +3546,6 @@
         </w:rPr>
         <w:t>Adapter</w:t>
       </w:r>
-      <w:proofErr w:type="spellEnd"/>
       <w:r>
         <w:rPr>
           <w:rFonts w:asciiTheme="minorHAnsi" w:hAnsiTheme="minorHAnsi" w:cstheme="minorHAnsi"/>
@@ -4735,27 +3624,7 @@
           <w:sz w:val="20"/>
           <w:szCs w:val="20"/>
         </w:rPr>
-        <w:t xml:space="preserve">1. Analiza el problema de incompatibilidad de interfaces heterogéneas y justifica la idoneidad del patrón </w:t>
-      </w:r>
-      <w:proofErr w:type="spellStart"/>
-      <w:r>
-        <w:rPr>
-          <w:rFonts w:asciiTheme="minorHAnsi" w:hAnsiTheme="minorHAnsi" w:cstheme="minorHAnsi"/>
-          <w:color w:val="767171" w:themeColor="background2" w:themeShade="80"/>
-          <w:sz w:val="20"/>
-          <w:szCs w:val="20"/>
-        </w:rPr>
-        <w:t>Adapter</w:t>
-      </w:r>
-      <w:proofErr w:type="spellEnd"/>
-      <w:r>
-        <w:rPr>
-          <w:rFonts w:asciiTheme="minorHAnsi" w:hAnsiTheme="minorHAnsi" w:cstheme="minorHAnsi"/>
-          <w:color w:val="767171" w:themeColor="background2" w:themeShade="80"/>
-          <w:sz w:val="20"/>
-          <w:szCs w:val="20"/>
-        </w:rPr>
-        <w:t xml:space="preserve">. </w:t>
+        <w:t xml:space="preserve">1. Analiza el problema de incompatibilidad de interfaces heterogéneas y justifica la idoneidad del patrón Adapter. </w:t>
       </w:r>
     </w:p>
     <w:p>
@@ -4778,47 +3647,7 @@
           <w:sz w:val="20"/>
           <w:szCs w:val="20"/>
         </w:rPr>
-        <w:t xml:space="preserve">2. Identifica con precisión los roles del patrón en este contexto (Target, </w:t>
-      </w:r>
-      <w:proofErr w:type="spellStart"/>
-      <w:r>
-        <w:rPr>
-          <w:rFonts w:asciiTheme="minorHAnsi" w:hAnsiTheme="minorHAnsi" w:cstheme="minorHAnsi"/>
-          <w:color w:val="767171" w:themeColor="background2" w:themeShade="80"/>
-          <w:sz w:val="20"/>
-          <w:szCs w:val="20"/>
-        </w:rPr>
-        <w:t>Adaptee</w:t>
-      </w:r>
-      <w:proofErr w:type="spellEnd"/>
-      <w:r>
-        <w:rPr>
-          <w:rFonts w:asciiTheme="minorHAnsi" w:hAnsiTheme="minorHAnsi" w:cstheme="minorHAnsi"/>
-          <w:color w:val="767171" w:themeColor="background2" w:themeShade="80"/>
-          <w:sz w:val="20"/>
-          <w:szCs w:val="20"/>
-        </w:rPr>
-        <w:t xml:space="preserve">, </w:t>
-      </w:r>
-      <w:proofErr w:type="spellStart"/>
-      <w:r>
-        <w:rPr>
-          <w:rFonts w:asciiTheme="minorHAnsi" w:hAnsiTheme="minorHAnsi" w:cstheme="minorHAnsi"/>
-          <w:color w:val="767171" w:themeColor="background2" w:themeShade="80"/>
-          <w:sz w:val="20"/>
-          <w:szCs w:val="20"/>
-        </w:rPr>
-        <w:t>Adapter</w:t>
-      </w:r>
-      <w:proofErr w:type="spellEnd"/>
-      <w:r>
-        <w:rPr>
-          <w:rFonts w:asciiTheme="minorHAnsi" w:hAnsiTheme="minorHAnsi" w:cstheme="minorHAnsi"/>
-          <w:color w:val="767171" w:themeColor="background2" w:themeShade="80"/>
-          <w:sz w:val="20"/>
-          <w:szCs w:val="20"/>
-        </w:rPr>
-        <w:t xml:space="preserve"> y Client). </w:t>
+        <w:t xml:space="preserve">2. Identifica con precisión los roles del patrón en este contexto (Target, Adaptee, Adapter y Client). </w:t>
       </w:r>
     </w:p>
     <w:p>
@@ -4841,27 +3670,7 @@
           <w:sz w:val="20"/>
           <w:szCs w:val="20"/>
         </w:rPr>
-        <w:t xml:space="preserve">3. Diseña una solución orientada a objetos que incluya un modelo de datos normalizado para aislar al sistema institucional de los formatos crudos de los proveedores. 4. Genera el diagrama de clases en formato </w:t>
-      </w:r>
-      <w:proofErr w:type="spellStart"/>
-      <w:r>
-        <w:rPr>
-          <w:rFonts w:asciiTheme="minorHAnsi" w:hAnsiTheme="minorHAnsi" w:cstheme="minorHAnsi"/>
-          <w:color w:val="767171" w:themeColor="background2" w:themeShade="80"/>
-          <w:sz w:val="20"/>
-          <w:szCs w:val="20"/>
-        </w:rPr>
-        <w:t>Mermaid</w:t>
-      </w:r>
-      <w:proofErr w:type="spellEnd"/>
-      <w:r>
-        <w:rPr>
-          <w:rFonts w:asciiTheme="minorHAnsi" w:hAnsiTheme="minorHAnsi" w:cstheme="minorHAnsi"/>
-          <w:color w:val="767171" w:themeColor="background2" w:themeShade="80"/>
-          <w:sz w:val="20"/>
-          <w:szCs w:val="20"/>
-        </w:rPr>
-        <w:t xml:space="preserve"> y modela la capacidad de soportar múltiples adaptadores en paralelo. </w:t>
+        <w:t xml:space="preserve">3. Diseña una solución orientada a objetos que incluya un modelo de datos normalizado para aislar al sistema institucional de los formatos crudos de los proveedores. 4. Genera el diagrama de clases en formato Mermaid y modela la capacidad de soportar múltiples adaptadores en paralelo. </w:t>
       </w:r>
     </w:p>
     <w:p>
@@ -4947,16 +3756,7 @@
           <w:sz w:val="20"/>
           <w:szCs w:val="20"/>
         </w:rPr>
-        <w:t>Justifica las decisiones de diseño bajo un enfoque de mantenibilidad empresarial a largo plazo.</w:t>
-      </w:r>
-      <w:r>
-        <w:rPr>
-          <w:rFonts w:asciiTheme="minorHAnsi" w:hAnsiTheme="minorHAnsi" w:cstheme="minorHAnsi"/>
-          <w:color w:val="767171" w:themeColor="background2" w:themeShade="80"/>
-          <w:sz w:val="20"/>
-          <w:szCs w:val="20"/>
-        </w:rPr>
-        <w:t>"</w:t>
+        <w:t>Justifica las decisiones de diseño bajo un enfoque de mantenibilidad empresarial a largo plazo."</w:t>
       </w:r>
     </w:p>
     <w:p>
@@ -4983,19 +3783,23 @@
           <w:sz w:val="20"/>
           <w:szCs w:val="20"/>
         </w:rPr>
-        <w:t xml:space="preserve">Recomendación aceptada (con justificación): Crear una clase de transferencia de datos </w:t>
-      </w:r>
-      <w:proofErr w:type="spellStart"/>
-      <w:r>
+        <w:t xml:space="preserve">Recomendación aceptada (con justificación): Crear una clase de transferencia de datos RegistroNormalizado para estandarizar el formato de salida devuelto por el adaptador.</w:t>
+      </w:r>
+    </w:p>
+    <w:p>
+      <w:pPr>
+        <w:pStyle w:val="NormalWeb"/>
+        <w:shd w:val="clear" w:color="auto" w:fill="FFFFFF"/>
+        <w:spacing w:line="360" w:lineRule="auto"/>
+        <w:ind w:left="720"/>
+        <w:jc w:val="both"/>
         <w:rPr>
           <w:rFonts w:asciiTheme="minorHAnsi" w:hAnsiTheme="minorHAnsi" w:cstheme="minorHAnsi"/>
           <w:color w:val="767171" w:themeColor="background2" w:themeShade="80"/>
           <w:sz w:val="20"/>
           <w:szCs w:val="20"/>
         </w:rPr>
-        <w:t>RegistroNormalizado</w:t>
-      </w:r>
-      <w:proofErr w:type="spellEnd"/>
+      </w:pPr>
       <w:r>
         <w:rPr>
           <w:rFonts w:asciiTheme="minorHAnsi" w:hAnsiTheme="minorHAnsi" w:cstheme="minorHAnsi"/>
@@ -5003,7 +3807,7 @@
           <w:sz w:val="20"/>
           <w:szCs w:val="20"/>
         </w:rPr>
-        <w:t xml:space="preserve"> para estandarizar el formato de salida devuelto por el adaptador. Justificación: Asegura que el sistema cliente no dependa de estructuras de arreglos de cadenas (String[]) crudos propios del proveedor.</w:t>
+        <w:t xml:space="preserve">Justificación: Asegura que el sistema cliente no dependa de estructuras de arreglos de cadenas (String[]) crudos propios del proveedor.</w:t>
       </w:r>
     </w:p>
     <w:p>
@@ -5030,47 +3834,7 @@
           <w:sz w:val="20"/>
           <w:szCs w:val="20"/>
         </w:rPr>
-        <w:t>Recomendación modificada o rechazada (con justificación): La IA sugirió que el adaptador heredara directamente de la clase del fabricante mediante herencia múltiple (</w:t>
-      </w:r>
-      <w:proofErr w:type="spellStart"/>
-      <w:r>
-        <w:rPr>
-          <w:rFonts w:asciiTheme="minorHAnsi" w:hAnsiTheme="minorHAnsi" w:cstheme="minorHAnsi"/>
-          <w:color w:val="767171" w:themeColor="background2" w:themeShade="80"/>
-          <w:sz w:val="20"/>
-          <w:szCs w:val="20"/>
-        </w:rPr>
-        <w:t>Adapter</w:t>
-      </w:r>
-      <w:proofErr w:type="spellEnd"/>
-      <w:r>
-        <w:rPr>
-          <w:rFonts w:asciiTheme="minorHAnsi" w:hAnsiTheme="minorHAnsi" w:cstheme="minorHAnsi"/>
-          <w:color w:val="767171" w:themeColor="background2" w:themeShade="80"/>
-          <w:sz w:val="20"/>
-          <w:szCs w:val="20"/>
-        </w:rPr>
-        <w:t xml:space="preserve"> de clases). Justificación: Se rechazó y se modificó por un </w:t>
-      </w:r>
-      <w:proofErr w:type="spellStart"/>
-      <w:r>
-        <w:rPr>
-          <w:rFonts w:asciiTheme="minorHAnsi" w:hAnsiTheme="minorHAnsi" w:cstheme="minorHAnsi"/>
-          <w:color w:val="767171" w:themeColor="background2" w:themeShade="80"/>
-          <w:sz w:val="20"/>
-          <w:szCs w:val="20"/>
-        </w:rPr>
-        <w:t>Adapter</w:t>
-      </w:r>
-      <w:proofErr w:type="spellEnd"/>
-      <w:r>
-        <w:rPr>
-          <w:rFonts w:asciiTheme="minorHAnsi" w:hAnsiTheme="minorHAnsi" w:cstheme="minorHAnsi"/>
-          <w:color w:val="767171" w:themeColor="background2" w:themeShade="80"/>
-          <w:sz w:val="20"/>
-          <w:szCs w:val="20"/>
-        </w:rPr>
-        <w:t xml:space="preserve"> de objetos basado en composición, ya que en Java no existe la herencia múltiple de clases y la composición desacopla de forma más robusta las librerías de terceros.</w:t>
+        <w:t xml:space="preserve">Recomendación modificada o rechazada (con justificación): La IA sugirió que el adaptador heredara directamente de la clase del fabricante mediante herencia múltiple (Adapter de clases).</w:t>
       </w:r>
     </w:p>
     <w:p>
@@ -5078,15 +3842,24 @@
         <w:pStyle w:val="NormalWeb"/>
         <w:shd w:val="clear" w:color="auto" w:fill="FFFFFF"/>
         <w:spacing w:line="360" w:lineRule="auto"/>
+        <w:ind w:left="720"/>
         <w:jc w:val="both"/>
         <w:rPr>
           <w:rFonts w:asciiTheme="minorHAnsi" w:hAnsiTheme="minorHAnsi" w:cstheme="minorHAnsi"/>
           <w:color w:val="767171" w:themeColor="background2" w:themeShade="80"/>
           <w:sz w:val="20"/>
           <w:szCs w:val="20"/>
-          <w:lang w:val="es-MX"/>
-        </w:rPr>
-      </w:pPr>
+        </w:rPr>
+      </w:pPr>
+      <w:r>
+        <w:rPr>
+          <w:rFonts w:asciiTheme="minorHAnsi" w:hAnsiTheme="minorHAnsi" w:cstheme="minorHAnsi"/>
+          <w:color w:val="767171" w:themeColor="background2" w:themeShade="80"/>
+          <w:sz w:val="20"/>
+          <w:szCs w:val="20"/>
+        </w:rPr>
+        <w:t xml:space="preserve">Justificación: Se rechazó y se modificó por un Adapter de objetos basado en composición, ya que en Java no existe la herencia múltiple de clases y la composición desacopla de forma más robusta las librerías de terceros.</w:t>
+      </w:r>
     </w:p>
     <w:p>
       <w:pPr>
@@ -5095,89 +3868,13 @@
         <w:spacing w:line="360" w:lineRule="auto"/>
         <w:jc w:val="both"/>
         <w:rPr>
-          <w:rFonts w:asciiTheme="minorHAnsi" w:eastAsiaTheme="majorEastAsia" w:hAnsiTheme="minorHAnsi" w:cstheme="minorHAnsi"/>
-          <w:b/>
-          <w:bCs/>
-          <w:color w:val="2F5496" w:themeColor="accent1" w:themeShade="BF"/>
-          <w:sz w:val="20"/>
-          <w:szCs w:val="20"/>
-          <w:lang w:eastAsia="en-US"/>
-        </w:rPr>
-      </w:pPr>
-      <w:r>
-        <w:rPr>
-          <w:rFonts w:asciiTheme="minorHAnsi" w:eastAsiaTheme="majorEastAsia" w:hAnsiTheme="minorHAnsi" w:cstheme="minorHAnsi"/>
-          <w:b/>
-          <w:bCs/>
-          <w:color w:val="2F5496" w:themeColor="accent1" w:themeShade="BF"/>
-          <w:sz w:val="20"/>
-          <w:szCs w:val="20"/>
-          <w:lang w:eastAsia="en-US"/>
-        </w:rPr>
-        <w:t>Conclusiones de la Actividad</w:t>
-      </w:r>
-      <w:r>
-        <w:rPr>
-          <w:rFonts w:asciiTheme="minorHAnsi" w:eastAsiaTheme="majorEastAsia" w:hAnsiTheme="minorHAnsi" w:cstheme="minorHAnsi"/>
-          <w:b/>
-          <w:bCs/>
-          <w:color w:val="2F5496" w:themeColor="accent1" w:themeShade="BF"/>
-          <w:sz w:val="20"/>
-          <w:szCs w:val="20"/>
-          <w:lang w:eastAsia="en-US"/>
-        </w:rPr>
-        <w:t xml:space="preserve"> (</w:t>
-      </w:r>
-      <w:r>
-        <w:rPr>
-          <w:rFonts w:asciiTheme="minorHAnsi" w:eastAsiaTheme="majorEastAsia" w:hAnsiTheme="minorHAnsi" w:cstheme="minorHAnsi"/>
-          <w:b/>
-          <w:bCs/>
-          <w:color w:val="2F5496" w:themeColor="accent1" w:themeShade="BF"/>
-          <w:sz w:val="20"/>
-          <w:szCs w:val="20"/>
-          <w:lang w:eastAsia="en-US"/>
-        </w:rPr>
-        <w:t xml:space="preserve">IEEE / SWEBOK V4.0a (2025) &amp; Asaad &amp; </w:t>
-      </w:r>
-      <w:proofErr w:type="spellStart"/>
-      <w:r>
-        <w:rPr>
-          <w:rFonts w:asciiTheme="minorHAnsi" w:eastAsiaTheme="majorEastAsia" w:hAnsiTheme="minorHAnsi" w:cstheme="minorHAnsi"/>
-          <w:b/>
-          <w:bCs/>
-          <w:color w:val="2F5496" w:themeColor="accent1" w:themeShade="BF"/>
-          <w:sz w:val="20"/>
-          <w:szCs w:val="20"/>
-          <w:lang w:eastAsia="en-US"/>
-        </w:rPr>
-        <w:t>Avksentieva</w:t>
-      </w:r>
-      <w:proofErr w:type="spellEnd"/>
-      <w:r>
-        <w:rPr>
-          <w:rFonts w:asciiTheme="minorHAnsi" w:eastAsiaTheme="majorEastAsia" w:hAnsiTheme="minorHAnsi" w:cstheme="minorHAnsi"/>
-          <w:b/>
-          <w:bCs/>
-          <w:color w:val="2F5496" w:themeColor="accent1" w:themeShade="BF"/>
-          <w:sz w:val="20"/>
-          <w:szCs w:val="20"/>
-          <w:lang w:eastAsia="en-US"/>
-        </w:rPr>
-        <w:t xml:space="preserve"> (2025)</w:t>
-      </w:r>
-      <w:r>
-        <w:rPr>
-          <w:rFonts w:asciiTheme="minorHAnsi" w:eastAsiaTheme="majorEastAsia" w:hAnsiTheme="minorHAnsi" w:cstheme="minorHAnsi"/>
-          <w:b/>
-          <w:bCs/>
-          <w:color w:val="2F5496" w:themeColor="accent1" w:themeShade="BF"/>
-          <w:sz w:val="20"/>
-          <w:szCs w:val="20"/>
-          <w:lang w:eastAsia="en-US"/>
-        </w:rPr>
-        <w:t>)</w:t>
-      </w:r>
+          <w:rFonts w:asciiTheme="minorHAnsi" w:hAnsiTheme="minorHAnsi" w:cstheme="minorHAnsi"/>
+          <w:color w:val="767171" w:themeColor="background2" w:themeShade="80"/>
+          <w:sz w:val="20"/>
+          <w:szCs w:val="20"/>
+          <w:lang w:val="es-MX"/>
+        </w:rPr>
+      </w:pPr>
     </w:p>
     <w:p>
       <w:pPr>
@@ -5186,40 +3883,26 @@
         <w:spacing w:line="360" w:lineRule="auto"/>
         <w:jc w:val="both"/>
         <w:rPr>
-          <w:rFonts w:asciiTheme="minorHAnsi" w:hAnsiTheme="minorHAnsi" w:cstheme="minorHAnsi"/>
-          <w:color w:val="767171" w:themeColor="background2" w:themeShade="80"/>
-          <w:sz w:val="20"/>
-          <w:szCs w:val="20"/>
-        </w:rPr>
-      </w:pPr>
-      <w:r>
-        <w:rPr>
-          <w:rFonts w:asciiTheme="minorHAnsi" w:hAnsiTheme="minorHAnsi" w:cstheme="minorHAnsi"/>
-          <w:color w:val="767171" w:themeColor="background2" w:themeShade="80"/>
-          <w:sz w:val="20"/>
-          <w:szCs w:val="20"/>
-        </w:rPr>
-        <w:t xml:space="preserve">La implementación de los patrones estructurales Composite y </w:t>
-      </w:r>
-      <w:proofErr w:type="spellStart"/>
-      <w:r>
-        <w:rPr>
-          <w:rFonts w:asciiTheme="minorHAnsi" w:hAnsiTheme="minorHAnsi" w:cstheme="minorHAnsi"/>
-          <w:color w:val="767171" w:themeColor="background2" w:themeShade="80"/>
-          <w:sz w:val="20"/>
-          <w:szCs w:val="20"/>
-        </w:rPr>
-        <w:t>Adapter</w:t>
-      </w:r>
-      <w:proofErr w:type="spellEnd"/>
-      <w:r>
-        <w:rPr>
-          <w:rFonts w:asciiTheme="minorHAnsi" w:hAnsiTheme="minorHAnsi" w:cstheme="minorHAnsi"/>
-          <w:color w:val="767171" w:themeColor="background2" w:themeShade="80"/>
-          <w:sz w:val="20"/>
-          <w:szCs w:val="20"/>
-        </w:rPr>
-        <w:t xml:space="preserve"> evidenció cómo las buenas prácticas de diseño de software permiten construir soluciones más flexibles, mantenibles y alineadas con las necesidades reales de una organización. Más allá de resolver problemas técnicos específicos, estos patrones facilitan que los sistemas puedan evolucionar y adaptarse al cambio sin afectar su funcionamiento principal.</w:t>
+          <w:rFonts w:asciiTheme="minorHAnsi" w:eastAsiaTheme="majorEastAsia" w:hAnsiTheme="minorHAnsi" w:cstheme="minorHAnsi"/>
+          <w:b/>
+          <w:bCs/>
+          <w:color w:val="2F5496" w:themeColor="accent1" w:themeShade="BF"/>
+          <w:sz w:val="20"/>
+          <w:szCs w:val="20"/>
+          <w:lang w:eastAsia="en-US"/>
+        </w:rPr>
+      </w:pPr>
+      <w:r>
+        <w:rPr>
+          <w:rFonts w:asciiTheme="minorHAnsi" w:eastAsiaTheme="majorEastAsia" w:hAnsiTheme="minorHAnsi" w:cstheme="minorHAnsi"/>
+          <w:b/>
+          <w:bCs/>
+          <w:color w:val="2F5496" w:themeColor="accent1" w:themeShade="BF"/>
+          <w:sz w:val="20"/>
+          <w:szCs w:val="20"/>
+          <w:lang w:eastAsia="en-US"/>
+        </w:rPr>
+        <w:t xml:space="preserve">Conclusiones de la Actividad (IEEE / SWEBOK V4.0a (2025) &amp; Asaad &amp; Avksentieva (2025))</w:t>
       </w:r>
     </w:p>
     <w:p>
@@ -5242,7 +3925,7 @@
           <w:sz w:val="20"/>
           <w:szCs w:val="20"/>
         </w:rPr>
-        <w:t>En el caso del patrón Composite, su aplicación en la gestión de la estructura presupuestaria permitió representar áreas, programas, proyectos y partidas como una única jerarquía organizada. Esto hizo posible realizar operaciones de consulta, cálculo y consolidación de manera uniforme, independientemente de si se trataba de un elemento individual o de un conjunto de elementos agrupados. Desde la perspectiva técnica, se redujo la complejidad del código y se favoreció el cumplimiento del principio Abierto/Cerrado (OCP); desde la perspectiva del usuario, se obtuvo una visión más clara y consistente de la información presupuestaria, facilitando el análisis y la toma de decisiones.</w:t>
+        <w:t xml:space="preserve">La actividad permitió comprobar que los patrones estructurales resuelven problemas concretos de diseño cuando se eligen a partir del contexto. El patrón Composite permitió representar el presupuesto institucional como un árbol en el que partidas y grupos comparten la interfaz IElementoPresupuestario. Gracias a ello, el cliente calcula totales y muestra la estructura sin condicionales, el cálculo recursivo abarca cualquier nivel de anidamiento y es posible incorporar nuevos grupos sin modificar la lógica de consulta, en concordancia con el principio Abierto/Cerrado.</w:t>
       </w:r>
     </w:p>
     <w:p>
@@ -5265,27 +3948,7 @@
           <w:sz w:val="20"/>
           <w:szCs w:val="20"/>
         </w:rPr>
-        <w:t xml:space="preserve">Por otra parte, el patrón </w:t>
-      </w:r>
-      <w:proofErr w:type="spellStart"/>
-      <w:r>
-        <w:rPr>
-          <w:rFonts w:asciiTheme="minorHAnsi" w:hAnsiTheme="minorHAnsi" w:cstheme="minorHAnsi"/>
-          <w:color w:val="767171" w:themeColor="background2" w:themeShade="80"/>
-          <w:sz w:val="20"/>
-          <w:szCs w:val="20"/>
-        </w:rPr>
-        <w:t>Adapter</w:t>
-      </w:r>
-      <w:proofErr w:type="spellEnd"/>
-      <w:r>
-        <w:rPr>
-          <w:rFonts w:asciiTheme="minorHAnsi" w:hAnsiTheme="minorHAnsi" w:cstheme="minorHAnsi"/>
-          <w:color w:val="767171" w:themeColor="background2" w:themeShade="80"/>
-          <w:sz w:val="20"/>
-          <w:szCs w:val="20"/>
-        </w:rPr>
-        <w:t xml:space="preserve"> demostró su utilidad al integrar dispositivos biométricos de diferentes fabricantes dentro de un mismo sistema universitario. Técnicamente, permitió desacoplar la lógica del sistema de las interfaces particulares de cada proveedor, evitando modificaciones en los componentes centrales ante futuros cambios tecnológicos. Para los usuarios finales, esto se traduce en una operación transparente y homogénea, donde distintos dispositivos pueden utilizarse de la misma manera sin necesidad de aprender procesos diferentes ni afectar la continuidad del servicio.</w:t>
+        <w:t xml:space="preserve">El patrón Adapter, por su parte, permitió integrar dispositivos biométricos con interfaces incompatibles manteniendo estable el contrato ISistemaAsistencia. Cada adaptador concentra las transformaciones propias de su fabricante, como la conversión de identificadores, formatos de fecha y estructuras de respuesta, por lo que integrar un nuevo proveedor solo requiere un nuevo adaptador. En conjunto, ambos patrones reducen el acoplamiento, favorecen la reutilización y preparan a los sistemas institucionales para evolucionar con un menor costo de mantenimiento. Finalmente, el uso de la inteligencia artificial resultó útil para contrastar alternativas, pero exigió validar críticamente sus propuestas: se aceptaron las que mejoraban el diseño y se rechazaron las que contradecían las restricciones del lenguaje o la seguridad del modelo.</w:t>
       </w:r>
     </w:p>
     <w:p>
@@ -5295,49 +3958,6 @@
         <w:spacing w:line="360" w:lineRule="auto"/>
         <w:jc w:val="both"/>
         <w:rPr>
-          <w:rFonts w:asciiTheme="minorHAnsi" w:hAnsiTheme="minorHAnsi" w:cstheme="minorHAnsi"/>
-          <w:color w:val="767171" w:themeColor="background2" w:themeShade="80"/>
-          <w:sz w:val="20"/>
-          <w:szCs w:val="20"/>
-        </w:rPr>
-      </w:pPr>
-      <w:r>
-        <w:rPr>
-          <w:rFonts w:asciiTheme="minorHAnsi" w:hAnsiTheme="minorHAnsi" w:cstheme="minorHAnsi"/>
-          <w:color w:val="767171" w:themeColor="background2" w:themeShade="80"/>
-          <w:sz w:val="20"/>
-          <w:szCs w:val="20"/>
-        </w:rPr>
-        <w:t xml:space="preserve">En conjunto, ambos patrones estructurales demuestran que una arquitectura bien diseñada no solo mejora la calidad técnica del software, sino que también genera beneficios tangibles para la organización. Mientras Composite facilita la gestión eficiente de estructuras complejas mediante una representación jerárquica uniforme, </w:t>
-      </w:r>
-      <w:proofErr w:type="spellStart"/>
-      <w:r>
-        <w:rPr>
-          <w:rFonts w:asciiTheme="minorHAnsi" w:hAnsiTheme="minorHAnsi" w:cstheme="minorHAnsi"/>
-          <w:color w:val="767171" w:themeColor="background2" w:themeShade="80"/>
-          <w:sz w:val="20"/>
-          <w:szCs w:val="20"/>
-        </w:rPr>
-        <w:t>Adapter</w:t>
-      </w:r>
-      <w:proofErr w:type="spellEnd"/>
-      <w:r>
-        <w:rPr>
-          <w:rFonts w:asciiTheme="minorHAnsi" w:hAnsiTheme="minorHAnsi" w:cstheme="minorHAnsi"/>
-          <w:color w:val="767171" w:themeColor="background2" w:themeShade="80"/>
-          <w:sz w:val="20"/>
-          <w:szCs w:val="20"/>
-        </w:rPr>
-        <w:t xml:space="preserve"> garantiza la interoperabilidad entre tecnologías heterogéneas. La combinación de estos patrones contribuye al desarrollo de sistemas más escalables, reutilizables y preparados para responder a los cambios del entorno empresarial, reduciendo costos de mantenimiento y mejorando la experiencia de uso de los usuarios finales.</w:t>
-      </w:r>
-    </w:p>
-    <w:p>
-      <w:pPr>
-        <w:pStyle w:val="NormalWeb"/>
-        <w:shd w:val="clear" w:color="auto" w:fill="FFFFFF"/>
-        <w:spacing w:line="360" w:lineRule="auto"/>
-        <w:jc w:val="both"/>
-        <w:rPr>
           <w:rFonts w:cstheme="minorHAnsi"/>
           <w:b/>
           <w:bCs/>
@@ -5347,7 +3967,6 @@
           <w:lang w:val="en-US"/>
         </w:rPr>
       </w:pPr>
-      <w:proofErr w:type="spellStart"/>
       <w:r>
         <w:rPr>
           <w:rFonts w:cstheme="minorHAnsi"/>
@@ -5359,35 +3978,8 @@
           <w:lang w:val="en-US"/>
         </w:rPr>
         <w:lastRenderedPageBreak/>
-        <w:t>Referencias</w:t>
-      </w:r>
-      <w:proofErr w:type="spellEnd"/>
-      <w:r>
-        <w:rPr>
-          <w:rFonts w:cstheme="minorHAnsi"/>
-          <w:b/>
-          <w:bCs/>
-          <w:color w:val="767171" w:themeColor="background2" w:themeShade="80"/>
-          <w:sz w:val="20"/>
-          <w:szCs w:val="20"/>
-          <w:lang w:val="en-US"/>
-        </w:rPr>
-        <w:t xml:space="preserve"> </w:t>
-      </w:r>
-      <w:proofErr w:type="spellStart"/>
-      <w:r>
-        <w:rPr>
-          <w:rFonts w:cstheme="minorHAnsi"/>
-          <w:b/>
-          <w:bCs/>
-          <w:color w:val="767171" w:themeColor="background2" w:themeShade="80"/>
-          <w:sz w:val="20"/>
-          <w:szCs w:val="20"/>
-          <w:lang w:val="en-US"/>
-        </w:rPr>
-        <w:t>Bibliográficas</w:t>
-      </w:r>
-      <w:proofErr w:type="spellEnd"/>
+        <w:t xml:space="preserve">Referencias Bibliográficas</w:t>
+      </w:r>
     </w:p>
     <w:p>
       <w:pPr>
@@ -5427,33 +4019,7 @@
           <w:szCs w:val="20"/>
           <w:lang w:val="en-US"/>
         </w:rPr>
-        <w:t xml:space="preserve">Assessing the Impact of </w:t>
-      </w:r>
-      <w:proofErr w:type="spellStart"/>
-      <w:r>
-        <w:rPr>
-          <w:rFonts w:cstheme="minorHAnsi"/>
-          <w:i/>
-          <w:iCs/>
-          <w:color w:val="767171" w:themeColor="background2" w:themeShade="80"/>
-          <w:sz w:val="20"/>
-          <w:szCs w:val="20"/>
-          <w:lang w:val="en-US"/>
-        </w:rPr>
-        <w:t>GoF</w:t>
-      </w:r>
-      <w:proofErr w:type="spellEnd"/>
-      <w:r>
-        <w:rPr>
-          <w:rFonts w:cstheme="minorHAnsi"/>
-          <w:i/>
-          <w:iCs/>
-          <w:color w:val="767171" w:themeColor="background2" w:themeShade="80"/>
-          <w:sz w:val="20"/>
-          <w:szCs w:val="20"/>
-          <w:lang w:val="en-US"/>
-        </w:rPr>
-        <w:t xml:space="preserve"> Design Patterns on Software Engineering Practices</w:t>
+        <w:t xml:space="preserve">Assessing the Impact of GoF Design Patterns on Software Engineering Practices</w:t>
       </w:r>
       <w:r>
         <w:rPr>
@@ -5543,29 +4109,7 @@
           <w:szCs w:val="20"/>
           <w:lang w:val="en-US"/>
         </w:rPr>
-        <w:t xml:space="preserve">Gamma, E., Helm, R., Johnson, R., y </w:t>
-      </w:r>
-      <w:proofErr w:type="spellStart"/>
-      <w:r>
-        <w:rPr>
-          <w:rFonts w:cstheme="minorHAnsi"/>
-          <w:color w:val="767171" w:themeColor="background2" w:themeShade="80"/>
-          <w:sz w:val="20"/>
-          <w:szCs w:val="20"/>
-          <w:lang w:val="en-US"/>
-        </w:rPr>
-        <w:t>Vlissides</w:t>
-      </w:r>
-      <w:proofErr w:type="spellEnd"/>
-      <w:r>
-        <w:rPr>
-          <w:rFonts w:cstheme="minorHAnsi"/>
-          <w:color w:val="767171" w:themeColor="background2" w:themeShade="80"/>
-          <w:sz w:val="20"/>
-          <w:szCs w:val="20"/>
-          <w:lang w:val="en-US"/>
-        </w:rPr>
-        <w:t xml:space="preserve">, J. (1994). </w:t>
+        <w:t xml:space="preserve">Gamma, E., Helm, R., Johnson, R., y Vlissides, J. (1994). </w:t>
       </w:r>
       <w:r>
         <w:rPr>
@@ -5638,29 +4182,7 @@
           <w:szCs w:val="20"/>
           <w:lang w:val="en-US"/>
         </w:rPr>
-        <w:t xml:space="preserve"> (</w:t>
-      </w:r>
-      <w:proofErr w:type="spellStart"/>
-      <w:r>
-        <w:rPr>
-          <w:rFonts w:cstheme="minorHAnsi"/>
-          <w:color w:val="767171" w:themeColor="background2" w:themeShade="80"/>
-          <w:sz w:val="20"/>
-          <w:szCs w:val="20"/>
-          <w:lang w:val="en-US"/>
-        </w:rPr>
-        <w:t>Versión</w:t>
-      </w:r>
-      <w:proofErr w:type="spellEnd"/>
-      <w:r>
-        <w:rPr>
-          <w:rFonts w:cstheme="minorHAnsi"/>
-          <w:color w:val="767171" w:themeColor="background2" w:themeShade="80"/>
-          <w:sz w:val="20"/>
-          <w:szCs w:val="20"/>
-          <w:lang w:val="en-US"/>
-        </w:rPr>
-        <w:t xml:space="preserve"> 4.0a). IEEE.</w:t>
+        <w:t xml:space="preserve"> (Versión 4.0a). IEEE.</w:t>
       </w:r>
     </w:p>
     <w:p>
@@ -5681,7 +4203,6 @@
           <w:lang w:val="en-US"/>
         </w:rPr>
       </w:pPr>
-      <w:proofErr w:type="spellStart"/>
       <w:r>
         <w:rPr>
           <w:rFonts w:cstheme="minorHAnsi"/>
@@ -5690,18 +4211,7 @@
           <w:szCs w:val="20"/>
           <w:lang w:val="en-US"/>
         </w:rPr>
-        <w:t>Musch</w:t>
-      </w:r>
-      <w:proofErr w:type="spellEnd"/>
-      <w:r>
-        <w:rPr>
-          <w:rFonts w:cstheme="minorHAnsi"/>
-          <w:color w:val="767171" w:themeColor="background2" w:themeShade="80"/>
-          <w:sz w:val="20"/>
-          <w:szCs w:val="20"/>
-          <w:lang w:val="en-US"/>
-        </w:rPr>
-        <w:t xml:space="preserve">, O. (2023). </w:t>
+        <w:t xml:space="preserve">Musch, O. (2023). </w:t>
       </w:r>
       <w:r>
         <w:rPr>
@@ -5723,29 +4233,7 @@
           <w:szCs w:val="20"/>
           <w:lang w:val="en-US"/>
         </w:rPr>
-        <w:t xml:space="preserve"> (1.ª ed.). </w:t>
-      </w:r>
-      <w:proofErr w:type="spellStart"/>
-      <w:r>
-        <w:rPr>
-          <w:rFonts w:cstheme="minorHAnsi"/>
-          <w:color w:val="767171" w:themeColor="background2" w:themeShade="80"/>
-          <w:sz w:val="20"/>
-          <w:szCs w:val="20"/>
-          <w:lang w:val="en-US"/>
-        </w:rPr>
-        <w:t>Apress</w:t>
-      </w:r>
-      <w:proofErr w:type="spellEnd"/>
-      <w:r>
-        <w:rPr>
-          <w:rFonts w:cstheme="minorHAnsi"/>
-          <w:color w:val="767171" w:themeColor="background2" w:themeShade="80"/>
-          <w:sz w:val="20"/>
-          <w:szCs w:val="20"/>
-          <w:lang w:val="en-US"/>
-        </w:rPr>
-        <w:t>.</w:t>
+        <w:t xml:space="preserve"> (1.ª ed.). Apress.</w:t>
       </w:r>
     </w:p>
     <w:p>
@@ -5766,7 +4254,6 @@
           <w:lang w:val="en-US"/>
         </w:rPr>
       </w:pPr>
-      <w:proofErr w:type="spellStart"/>
       <w:r>
         <w:rPr>
           <w:rFonts w:cstheme="minorHAnsi"/>
@@ -5775,18 +4262,7 @@
           <w:szCs w:val="20"/>
           <w:lang w:val="en-US"/>
         </w:rPr>
-        <w:t>Sarcar</w:t>
-      </w:r>
-      <w:proofErr w:type="spellEnd"/>
-      <w:r>
-        <w:rPr>
-          <w:rFonts w:cstheme="minorHAnsi"/>
-          <w:color w:val="767171" w:themeColor="background2" w:themeShade="80"/>
-          <w:sz w:val="20"/>
-          <w:szCs w:val="20"/>
-          <w:lang w:val="en-US"/>
-        </w:rPr>
-        <w:t xml:space="preserve">, V. (2022). </w:t>
+        <w:t xml:space="preserve">Sarcar, V. (2022). </w:t>
       </w:r>
       <w:r>
         <w:rPr>
@@ -5808,29 +4284,7 @@
           <w:szCs w:val="20"/>
           <w:lang w:val="en-US"/>
         </w:rPr>
-        <w:t xml:space="preserve"> (3.ª ed.). </w:t>
-      </w:r>
-      <w:proofErr w:type="spellStart"/>
-      <w:r>
-        <w:rPr>
-          <w:rFonts w:cstheme="minorHAnsi"/>
-          <w:color w:val="767171" w:themeColor="background2" w:themeShade="80"/>
-          <w:sz w:val="20"/>
-          <w:szCs w:val="20"/>
-          <w:lang w:val="en-US"/>
-        </w:rPr>
-        <w:t>Apress</w:t>
-      </w:r>
-      <w:proofErr w:type="spellEnd"/>
-      <w:r>
-        <w:rPr>
-          <w:rFonts w:cstheme="minorHAnsi"/>
-          <w:color w:val="767171" w:themeColor="background2" w:themeShade="80"/>
-          <w:sz w:val="20"/>
-          <w:szCs w:val="20"/>
-          <w:lang w:val="en-US"/>
-        </w:rPr>
-        <w:t>.</w:t>
+        <w:t xml:space="preserve"> (3.ª ed.). Apress.</w:t>
       </w:r>
     </w:p>
     <w:p>
@@ -5883,7 +4337,6 @@
         </w:rPr>
         <w:t xml:space="preserve"> (1.ª ed.). </w:t>
       </w:r>
-      <w:proofErr w:type="spellStart"/>
       <w:r>
         <w:rPr>
           <w:rFonts w:cstheme="minorHAnsi"/>
@@ -5892,18 +4345,7 @@
           <w:szCs w:val="20"/>
           <w:lang w:val="en-US"/>
         </w:rPr>
-        <w:t>Refactoring.Guru</w:t>
-      </w:r>
-      <w:proofErr w:type="spellEnd"/>
-      <w:r>
-        <w:rPr>
-          <w:rFonts w:cstheme="minorHAnsi"/>
-          <w:color w:val="767171" w:themeColor="background2" w:themeShade="80"/>
-          <w:sz w:val="20"/>
-          <w:szCs w:val="20"/>
-          <w:lang w:val="en-US"/>
-        </w:rPr>
-        <w:t>.</w:t>
+        <w:t>Refactoring.Guru.</w:t>
       </w:r>
     </w:p>
     <w:p>

</xml_diff>